<commit_message>
Update UI create data
</commit_message>
<xml_diff>
--- a/คู่มือการใช้งาน Smart Tambon ฉบับปรับปรุง.docx
+++ b/คู่มือการใช้งาน Smart Tambon ฉบับปรับปรุง.docx
@@ -691,34 +691,34 @@
     </w:p>
     <w:p>
       <w:pPr>
-        <w:pStyle w:val="ListNumber"/>
+        <w:ind w:left="425" w:hanging="312"/>
       </w:pPr>
       <w:r>
-        <w:t>เปิดเว็บไซต์ของระบบ (เครื่องทดสอบ: http://localhost:3000)</w:t>
+        <w:t>1.  เปิดเว็บไซต์ของระบบ (เครื่องทดสอบ: http://localhost:3000)</w:t>
       </w:r>
     </w:p>
     <w:p>
       <w:pPr>
-        <w:pStyle w:val="ListNumber"/>
+        <w:ind w:left="425" w:hanging="312"/>
       </w:pPr>
       <w:r>
-        <w:t>กรอก ชื่อผู้ใช้งาน (ไม่ใช่อีเมล) และรหัสผ่านที่ได้รับจากผู้ดูแล</w:t>
+        <w:t>2.  กรอก ชื่อผู้ใช้งาน (ไม่ใช่อีเมล) และรหัสผ่านที่ได้รับจากผู้ดูแล</w:t>
       </w:r>
     </w:p>
     <w:p>
       <w:pPr>
-        <w:pStyle w:val="ListNumber"/>
+        <w:ind w:left="425" w:hanging="312"/>
       </w:pPr>
       <w:r>
-        <w:t>หากขึ้น “บัญชีนี้ยังไม่ได้กำหนด role หรือขอบเขตพื้นที่ดูแล” ให้ติดต่อผู้ดูแลให้กำหนดสิทธิ์และพื้นที่</w:t>
+        <w:t>3.  หากขึ้น “บัญชีนี้ยังไม่ได้กำหนด role หรือขอบเขตพื้นที่ดูแล” ให้ติดต่อผู้ดูแลให้กำหนดสิทธิ์และพื้นที่</w:t>
       </w:r>
     </w:p>
     <w:p>
       <w:pPr>
-        <w:pStyle w:val="ListNumber"/>
+        <w:ind w:left="425" w:hanging="312"/>
       </w:pPr>
       <w:r>
-        <w:t>ออกจากระบบด้วยปุ่ม “ออกจากระบบ” ด้านล่างเมนูซ้าย</w:t>
+        <w:t>4.  ออกจากระบบด้วยปุ่ม “ออกจากระบบ” ด้านล่างเมนูซ้าย</w:t>
       </w:r>
     </w:p>
     <w:p>
@@ -2620,377 +2620,53 @@
         <w:t>หน้าภาพรวมเมือง: การ์ดสรุปเหตุการณ์ พยากรณ์อากาศ สถานะภัย งานที่ต้องดำเนินการ และแผนที่</w:t>
       </w:r>
     </w:p>
-    <w:tbl>
-      <w:tblPr>
-        <w:tblW w:type="auto" w:w="0"/>
-        <w:jc w:val="center"/>
-        <w:tblLook w:firstColumn="1" w:firstRow="1" w:lastColumn="0" w:lastRow="0" w:noHBand="0" w:noVBand="1" w:val="04A0"/>
-        <w:tblBorders>
-          <w:top w:val="single" w:sz="4" w:color="D9D9D9"/>
-          <w:left w:val="single" w:sz="4" w:color="D9D9D9"/>
-          <w:bottom w:val="single" w:sz="4" w:color="D9D9D9"/>
-          <w:right w:val="single" w:sz="4" w:color="D9D9D9"/>
-          <w:insideH w:val="single" w:sz="4" w:color="D9D9D9"/>
-          <w:insideV w:val="single" w:sz="4" w:color="D9D9D9"/>
-        </w:tblBorders>
-      </w:tblPr>
-      <w:tblGrid>
-        <w:gridCol w:w="4762"/>
-        <w:gridCol w:w="4762"/>
-      </w:tblGrid>
-      <w:tr>
-        <w:tc>
-          <w:tcPr>
-            <w:tcW w:type="dxa" w:w="4762"/>
-            <w:vAlign w:val="center"/>
-            <w:tcMar>
-              <w:top w:w="100" w:type="dxa"/>
-              <w:start w:w="120" w:type="dxa"/>
-              <w:bottom w:w="100" w:type="dxa"/>
-              <w:end w:w="120" w:type="dxa"/>
-            </w:tcMar>
-            <w:shd w:fill="1F4E78"/>
-          </w:tcPr>
-          <w:p>
-            <w:pPr>
-              <w:spacing w:after="0"/>
-              <w:jc w:val="center"/>
-            </w:pPr>
-            <w:r>
-              <w:rPr>
-                <w:rFonts w:ascii="TH Sarabun New" w:hAnsi="TH Sarabun New" w:eastAsia="TH Sarabun New"/>
-                <w:b/>
-                <w:color w:val="FFFFFF"/>
-                <w:sz w:val="28"/>
-              </w:rPr>
-              <w:t>•</w:t>
-            </w:r>
-          </w:p>
-        </w:tc>
-        <w:tc>
-          <w:tcPr>
-            <w:tcW w:type="dxa" w:w="4762"/>
-            <w:vAlign w:val="center"/>
-            <w:tcMar>
-              <w:top w:w="100" w:type="dxa"/>
-              <w:start w:w="120" w:type="dxa"/>
-              <w:bottom w:w="100" w:type="dxa"/>
-              <w:end w:w="120" w:type="dxa"/>
-            </w:tcMar>
-            <w:shd w:fill="1F4E78"/>
-          </w:tcPr>
-          <w:p>
-            <w:pPr>
-              <w:spacing w:after="0"/>
-              <w:jc w:val="left"/>
-            </w:pPr>
-            <w:r>
-              <w:rPr>
-                <w:rFonts w:ascii="TH Sarabun New" w:hAnsi="TH Sarabun New" w:eastAsia="TH Sarabun New"/>
-                <w:b/>
-                <w:color w:val="FFFFFF"/>
-                <w:sz w:val="28"/>
-              </w:rPr>
-              <w:t>การ์ดสรุป: เหตุการณ์ทั้งหมดที่ได้รับแจ้ง (24 ชม.), แจ้งเตือนเข้ามาวันนี้, ยังไม่ได้รับการแก้ไข, แก้ไขเรียบร้อยแล้ว</w:t>
-            </w:r>
-          </w:p>
-        </w:tc>
-      </w:tr>
-      <w:tr>
-        <w:tc>
-          <w:tcPr>
-            <w:tcW w:type="dxa" w:w="4762"/>
-            <w:vAlign w:val="center"/>
-            <w:tcMar>
-              <w:top w:w="100" w:type="dxa"/>
-              <w:start w:w="120" w:type="dxa"/>
-              <w:bottom w:w="100" w:type="dxa"/>
-              <w:end w:w="120" w:type="dxa"/>
-            </w:tcMar>
-            <w:shd w:fill="FFFFFF"/>
-          </w:tcPr>
-          <w:p>
-            <w:pPr>
-              <w:spacing w:after="0"/>
-              <w:jc w:val="center"/>
-            </w:pPr>
-            <w:r>
-              <w:rPr>
-                <w:rFonts w:ascii="TH Sarabun New" w:hAnsi="TH Sarabun New" w:eastAsia="TH Sarabun New"/>
-                <w:b w:val="0"/>
-                <w:color w:val="000000"/>
-                <w:sz w:val="28"/>
-              </w:rPr>
-              <w:t>•</w:t>
-            </w:r>
-          </w:p>
-        </w:tc>
-        <w:tc>
-          <w:tcPr>
-            <w:tcW w:type="dxa" w:w="4762"/>
-            <w:vAlign w:val="center"/>
-            <w:tcMar>
-              <w:top w:w="100" w:type="dxa"/>
-              <w:start w:w="120" w:type="dxa"/>
-              <w:bottom w:w="100" w:type="dxa"/>
-              <w:end w:w="120" w:type="dxa"/>
-            </w:tcMar>
-            <w:shd w:fill="FFFFFF"/>
-          </w:tcPr>
-          <w:p>
-            <w:pPr>
-              <w:spacing w:after="0"/>
-              <w:jc w:val="left"/>
-            </w:pPr>
-            <w:r>
-              <w:rPr>
-                <w:rFonts w:ascii="TH Sarabun New" w:hAnsi="TH Sarabun New" w:eastAsia="TH Sarabun New"/>
-                <w:b w:val="0"/>
-                <w:color w:val="000000"/>
-                <w:sz w:val="28"/>
-              </w:rPr>
-              <w:t>สถานะภัยในพื้นที่ตอนนี้: จำนวนเหตุตามประเภท น้ำท่วม ไฟป่า พายุ ดินถล่ม ภัยแล้ง</w:t>
-            </w:r>
-          </w:p>
-        </w:tc>
-      </w:tr>
-      <w:tr>
-        <w:tc>
-          <w:tcPr>
-            <w:tcW w:type="dxa" w:w="4762"/>
-            <w:vAlign w:val="center"/>
-            <w:tcMar>
-              <w:top w:w="100" w:type="dxa"/>
-              <w:start w:w="120" w:type="dxa"/>
-              <w:bottom w:w="100" w:type="dxa"/>
-              <w:end w:w="120" w:type="dxa"/>
-            </w:tcMar>
-            <w:shd w:fill="EDF3F8"/>
-          </w:tcPr>
-          <w:p>
-            <w:pPr>
-              <w:spacing w:after="0"/>
-              <w:jc w:val="center"/>
-            </w:pPr>
-            <w:r>
-              <w:rPr>
-                <w:rFonts w:ascii="TH Sarabun New" w:hAnsi="TH Sarabun New" w:eastAsia="TH Sarabun New"/>
-                <w:b w:val="0"/>
-                <w:color w:val="000000"/>
-                <w:sz w:val="28"/>
-              </w:rPr>
-              <w:t>•</w:t>
-            </w:r>
-          </w:p>
-        </w:tc>
-        <w:tc>
-          <w:tcPr>
-            <w:tcW w:type="dxa" w:w="4762"/>
-            <w:vAlign w:val="center"/>
-            <w:tcMar>
-              <w:top w:w="100" w:type="dxa"/>
-              <w:start w:w="120" w:type="dxa"/>
-              <w:bottom w:w="100" w:type="dxa"/>
-              <w:end w:w="120" w:type="dxa"/>
-            </w:tcMar>
-            <w:shd w:fill="EDF3F8"/>
-          </w:tcPr>
-          <w:p>
-            <w:pPr>
-              <w:spacing w:after="0"/>
-              <w:jc w:val="left"/>
-            </w:pPr>
-            <w:r>
-              <w:rPr>
-                <w:rFonts w:ascii="TH Sarabun New" w:hAnsi="TH Sarabun New" w:eastAsia="TH Sarabun New"/>
-                <w:b w:val="0"/>
-                <w:color w:val="000000"/>
-                <w:sz w:val="28"/>
-              </w:rPr>
-              <w:t>งานที่ต้องดำเนินการ: เลือกแท็บ ทั้งหมด / รอรับเรื่อง / กำลังประเมิน / กำลังดำเนินการ แล้วคลิกงานเพื่อดูรายละเอียด</w:t>
-            </w:r>
-          </w:p>
-        </w:tc>
-      </w:tr>
-      <w:tr>
-        <w:tc>
-          <w:tcPr>
-            <w:tcW w:type="dxa" w:w="4762"/>
-            <w:vAlign w:val="center"/>
-            <w:tcMar>
-              <w:top w:w="100" w:type="dxa"/>
-              <w:start w:w="120" w:type="dxa"/>
-              <w:bottom w:w="100" w:type="dxa"/>
-              <w:end w:w="120" w:type="dxa"/>
-            </w:tcMar>
-            <w:shd w:fill="FFFFFF"/>
-          </w:tcPr>
-          <w:p>
-            <w:pPr>
-              <w:spacing w:after="0"/>
-              <w:jc w:val="center"/>
-            </w:pPr>
-            <w:r>
-              <w:rPr>
-                <w:rFonts w:ascii="TH Sarabun New" w:hAnsi="TH Sarabun New" w:eastAsia="TH Sarabun New"/>
-                <w:b w:val="0"/>
-                <w:color w:val="000000"/>
-                <w:sz w:val="28"/>
-              </w:rPr>
-              <w:t>•</w:t>
-            </w:r>
-          </w:p>
-        </w:tc>
-        <w:tc>
-          <w:tcPr>
-            <w:tcW w:type="dxa" w:w="4762"/>
-            <w:vAlign w:val="center"/>
-            <w:tcMar>
-              <w:top w:w="100" w:type="dxa"/>
-              <w:start w:w="120" w:type="dxa"/>
-              <w:bottom w:w="100" w:type="dxa"/>
-              <w:end w:w="120" w:type="dxa"/>
-            </w:tcMar>
-            <w:shd w:fill="FFFFFF"/>
-          </w:tcPr>
-          <w:p>
-            <w:pPr>
-              <w:spacing w:after="0"/>
-              <w:jc w:val="left"/>
-            </w:pPr>
-            <w:r>
-              <w:rPr>
-                <w:rFonts w:ascii="TH Sarabun New" w:hAnsi="TH Sarabun New" w:eastAsia="TH Sarabun New"/>
-                <w:b w:val="0"/>
-                <w:color w:val="000000"/>
-                <w:sz w:val="28"/>
-              </w:rPr>
-              <w:t>แผนที่ภาพรวมพื้นที่: สลับ “ถนน” / “ดาวเทียม” และเปิด-ปิด “ชั้นข้อมูลบนแผนที่” เช่น สถานีวัดน้ำและฝน, กล้องวงจรปิด, จุดความร้อน (เลือก 24 ชั่วโมง / 48 ชั่วโมง / 7 วัน), กิจกรรมในพื้นที่, โครงการ, ขอบเขตหมู่บ้าน และหมวดสถานที่ 8 หมวด (สถานที่ราชการ การศึกษา สาธารณสุข ฯลฯ)</w:t>
-            </w:r>
-          </w:p>
-        </w:tc>
-      </w:tr>
-      <w:tr>
-        <w:tc>
-          <w:tcPr>
-            <w:tcW w:type="dxa" w:w="4762"/>
-            <w:vAlign w:val="center"/>
-            <w:tcMar>
-              <w:top w:w="100" w:type="dxa"/>
-              <w:start w:w="120" w:type="dxa"/>
-              <w:bottom w:w="100" w:type="dxa"/>
-              <w:end w:w="120" w:type="dxa"/>
-            </w:tcMar>
-            <w:shd w:fill="EDF3F8"/>
-          </w:tcPr>
-          <w:p>
-            <w:pPr>
-              <w:spacing w:after="0"/>
-              <w:jc w:val="center"/>
-            </w:pPr>
-            <w:r>
-              <w:rPr>
-                <w:rFonts w:ascii="TH Sarabun New" w:hAnsi="TH Sarabun New" w:eastAsia="TH Sarabun New"/>
-                <w:b w:val="0"/>
-                <w:color w:val="000000"/>
-                <w:sz w:val="28"/>
-              </w:rPr>
-              <w:t>•</w:t>
-            </w:r>
-          </w:p>
-        </w:tc>
-        <w:tc>
-          <w:tcPr>
-            <w:tcW w:type="dxa" w:w="4762"/>
-            <w:vAlign w:val="center"/>
-            <w:tcMar>
-              <w:top w:w="100" w:type="dxa"/>
-              <w:start w:w="120" w:type="dxa"/>
-              <w:bottom w:w="100" w:type="dxa"/>
-              <w:end w:w="120" w:type="dxa"/>
-            </w:tcMar>
-            <w:shd w:fill="EDF3F8"/>
-          </w:tcPr>
-          <w:p>
-            <w:pPr>
-              <w:spacing w:after="0"/>
-              <w:jc w:val="left"/>
-            </w:pPr>
-            <w:r>
-              <w:rPr>
-                <w:rFonts w:ascii="TH Sarabun New" w:hAnsi="TH Sarabun New" w:eastAsia="TH Sarabun New"/>
-                <w:b w:val="0"/>
-                <w:color w:val="000000"/>
-                <w:sz w:val="28"/>
-              </w:rPr>
-              <w:t>สภาพอากาศและคุณภาพอากาศในพื้นที่: PM2.5 อุณหภูมิ ฝน รายตำบล พร้อมแหล่งที่มา เลือก “ดูข้อมูลทั้งหมด” เพื่อดูทุกตำบล</w:t>
-            </w:r>
-          </w:p>
-        </w:tc>
-      </w:tr>
-      <w:tr>
-        <w:tc>
-          <w:tcPr>
-            <w:tcW w:type="dxa" w:w="4762"/>
-            <w:vAlign w:val="center"/>
-            <w:tcMar>
-              <w:top w:w="100" w:type="dxa"/>
-              <w:start w:w="120" w:type="dxa"/>
-              <w:bottom w:w="100" w:type="dxa"/>
-              <w:end w:w="120" w:type="dxa"/>
-            </w:tcMar>
-            <w:shd w:fill="FFFFFF"/>
-          </w:tcPr>
-          <w:p>
-            <w:pPr>
-              <w:spacing w:after="0"/>
-              <w:jc w:val="center"/>
-            </w:pPr>
-            <w:r>
-              <w:rPr>
-                <w:rFonts w:ascii="TH Sarabun New" w:hAnsi="TH Sarabun New" w:eastAsia="TH Sarabun New"/>
-                <w:b w:val="0"/>
-                <w:color w:val="000000"/>
-                <w:sz w:val="28"/>
-              </w:rPr>
-              <w:t>•</w:t>
-            </w:r>
-          </w:p>
-        </w:tc>
-        <w:tc>
-          <w:tcPr>
-            <w:tcW w:type="dxa" w:w="4762"/>
-            <w:vAlign w:val="center"/>
-            <w:tcMar>
-              <w:top w:w="100" w:type="dxa"/>
-              <w:start w:w="120" w:type="dxa"/>
-              <w:bottom w:w="100" w:type="dxa"/>
-              <w:end w:w="120" w:type="dxa"/>
-            </w:tcMar>
-            <w:shd w:fill="FFFFFF"/>
-          </w:tcPr>
-          <w:p>
-            <w:pPr>
-              <w:spacing w:after="0"/>
-              <w:jc w:val="left"/>
-            </w:pPr>
-            <w:r>
-              <w:rPr>
-                <w:rFonts w:ascii="TH Sarabun New" w:hAnsi="TH Sarabun New" w:eastAsia="TH Sarabun New"/>
-                <w:b w:val="0"/>
-                <w:color w:val="000000"/>
-                <w:sz w:val="28"/>
-              </w:rPr>
-              <w:t>ข้อมูลพื้นฐานของตำบล: พื้นที่ (ตร.กม.) จำนวนหมู่บ้าน “ประชากรในพื้นที่รับผิดชอบ” รายหมู่บ้าน “ทรัพยากรในตำบล” และ “ทีมงานในพื้นที่” (พร้อม/ไม่พร้อม) - ส่วนนี้จะมีข้อมูลเมื่อนำเข้าชุดข้อมูลในหัวข้อ 3 แล้ว</w:t>
-            </w:r>
-          </w:p>
-        </w:tc>
-      </w:tr>
-    </w:tbl>
     <w:p>
       <w:pPr>
-        <w:spacing w:after="0"/>
-      </w:pPr>
+        <w:ind w:left="425" w:hanging="255"/>
+      </w:pPr>
+      <w:r>
+        <w:t>•  การ์ดสรุป: เหตุการณ์ทั้งหมดที่ได้รับแจ้ง (24 ชม.), แจ้งเตือนเข้ามาวันนี้, ยังไม่ได้รับการแก้ไข, แก้ไขเรียบร้อยแล้ว</w:t>
+      </w:r>
+    </w:p>
+    <w:p>
+      <w:pPr>
+        <w:ind w:left="425" w:hanging="255"/>
+      </w:pPr>
+      <w:r>
+        <w:t>•  สถานะภัยในพื้นที่ตอนนี้: จำนวนเหตุตามประเภท น้ำท่วม ไฟป่า พายุ ดินถล่ม ภัยแล้ง</w:t>
+      </w:r>
+    </w:p>
+    <w:p>
+      <w:pPr>
+        <w:ind w:left="425" w:hanging="255"/>
+      </w:pPr>
+      <w:r>
+        <w:t>•  งานที่ต้องดำเนินการ: เลือกแท็บ ทั้งหมด / รอรับเรื่อง / กำลังประเมิน / กำลังดำเนินการ แล้วคลิกงานเพื่อดูรายละเอียด</w:t>
+      </w:r>
+    </w:p>
+    <w:p>
+      <w:pPr>
+        <w:ind w:left="425" w:hanging="255"/>
+      </w:pPr>
+      <w:r>
+        <w:t>•  แผนที่ภาพรวมพื้นที่: สลับ “ถนน” / “ดาวเทียม” และเปิด-ปิด “ชั้นข้อมูลบนแผนที่” เช่น สถานีวัดน้ำและฝน, กล้องวงจรปิด, จุดความร้อน (เลือก 24 ชั่วโมง / 48 ชั่วโมง / 7 วัน), กิจกรรมในพื้นที่, โครงการ, ขอบเขตหมู่บ้าน และหมวดสถานที่ 8 หมวด (สถานที่ราชการ การศึกษา สาธารณสุข ฯลฯ)</w:t>
+      </w:r>
+    </w:p>
+    <w:p>
+      <w:pPr>
+        <w:ind w:left="425" w:hanging="255"/>
+      </w:pPr>
+      <w:r>
+        <w:t>•  สภาพอากาศและคุณภาพอากาศในพื้นที่: PM2.5 อุณหภูมิ ฝน รายตำบล พร้อมแหล่งที่มา เลือก “ดูข้อมูลทั้งหมด” เพื่อดูทุกตำบล</w:t>
+      </w:r>
+    </w:p>
+    <w:p>
+      <w:pPr>
+        <w:ind w:left="425" w:hanging="255"/>
+      </w:pPr>
+      <w:r>
+        <w:t>•  ข้อมูลพื้นฐานของตำบล: พื้นที่ (ตร.กม.) จำนวนหมู่บ้าน “ประชากรในพื้นที่รับผิดชอบ” รายหมู่บ้าน “ทรัพยากรในตำบล” และ “ทีมงานในพื้นที่” (พร้อม/ไม่พร้อม) - ส่วนนี้จะมีข้อมูลเมื่อนำเข้าชุดข้อมูลในหัวข้อ 3 แล้ว</w:t>
+      </w:r>
     </w:p>
     <w:p>
       <w:pPr>
@@ -3010,357 +2686,98 @@
     </w:p>
     <w:p>
       <w:pPr>
-        <w:pStyle w:val="ListNumber"/>
+        <w:pStyle w:val="Heading3"/>
       </w:pPr>
       <w:r>
-        <w:t>1. วิเคราะห์พื้นที่</w:t>
+        <w:t>การวิเคราะห์พื้นที่</w:t>
       </w:r>
     </w:p>
     <w:p>
       <w:pPr>
-        <w:pStyle w:val="ListNumber"/>
+        <w:keepNext/>
       </w:pPr>
       <w:r>
-        <w:t>เปิดเมนู “แผนที่เมือง” แล้วเลือกเครื่องมือ “วิเคราะห์พื้นที่”</w:t>
+        <w:rPr>
+          <w:rFonts w:ascii="TH Sarabun New" w:hAnsi="TH Sarabun New" w:eastAsia="TH Sarabun New"/>
+          <w:b w:val="0"/>
+          <w:i/>
+          <w:color w:val="666666"/>
+          <w:sz w:val="28"/>
+        </w:rPr>
+        <w:t>หน้าแผนที่เมือง: ขอบเขตตำบล ขอบเขตหมู่บ้าน และหมุดสถานที่สำคัญตามหมวด</w:t>
       </w:r>
     </w:p>
     <w:p>
       <w:pPr>
-        <w:pStyle w:val="ListNumber"/>
+        <w:ind w:left="425" w:hanging="312"/>
       </w:pPr>
       <w:r>
-        <w:t>เลือกรูปแบบ “จุด” / “เส้น” / “พื้นที่” และกำหนด “ระยะขยาย … เมตร” หากต้องการรัศมีรอบจุดหรือเส้น</w:t>
+        <w:t>1.  เปิดเมนู “แผนที่เมือง” แล้วเลือกเครื่องมือ “วิเคราะห์พื้นที่”</w:t>
       </w:r>
     </w:p>
     <w:p>
       <w:pPr>
-        <w:pStyle w:val="ListNumber"/>
+        <w:ind w:left="425" w:hanging="312"/>
       </w:pPr>
       <w:r>
-        <w:t>เลือก “ประเภทภัยที่ต้องการวางแผน” แล้ววาดบนแผนที่</w:t>
+        <w:t>2.  เลือกรูปแบบ “จุด” / “เส้น” / “พื้นที่” และกำหนด “ระยะขยาย … เมตร” หากต้องการรัศมีรอบจุดหรือเส้น</w:t>
       </w:r>
     </w:p>
     <w:p>
       <w:pPr>
-        <w:pStyle w:val="ListNumber"/>
+        <w:ind w:left="425" w:hanging="312"/>
       </w:pPr>
       <w:r>
-        <w:t>อ่าน “ผลการประเมินพื้นที่”: พื้นที่ได้รับผลกระทบ (ตร.กม./ไร่/ตร.ม.), ประชากรและครัวเรือนโดยประมาณ, กฎที่ผ่านเงื่อนไข, ทรัพยากรที่ต้องใช้เทียบกับที่มี, สถานที่สำคัญที่ได้รับผลกระทบ</w:t>
+        <w:t>3.  เลือก “ประเภทภัยที่ต้องการวางแผน” แล้ววาดบนแผนที่</w:t>
       </w:r>
     </w:p>
-    <w:tbl>
-      <w:tblPr>
-        <w:tblW w:type="auto" w:w="0"/>
-        <w:jc w:val="center"/>
-        <w:tblLook w:firstColumn="1" w:firstRow="1" w:lastColumn="0" w:lastRow="0" w:noHBand="0" w:noVBand="1" w:val="04A0"/>
-        <w:tblBorders>
-          <w:top w:val="single" w:sz="4" w:color="D9D9D9"/>
-          <w:left w:val="single" w:sz="4" w:color="D9D9D9"/>
-          <w:bottom w:val="single" w:sz="4" w:color="D9D9D9"/>
-          <w:right w:val="single" w:sz="4" w:color="D9D9D9"/>
-          <w:insideH w:val="single" w:sz="4" w:color="D9D9D9"/>
-          <w:insideV w:val="single" w:sz="4" w:color="D9D9D9"/>
-        </w:tblBorders>
-      </w:tblPr>
-      <w:tblGrid>
-        <w:gridCol w:w="4762"/>
-        <w:gridCol w:w="4762"/>
-      </w:tblGrid>
-      <w:tr>
-        <w:tc>
-          <w:tcPr>
-            <w:tcW w:type="dxa" w:w="4762"/>
-            <w:vAlign w:val="center"/>
-            <w:tcMar>
-              <w:top w:w="100" w:type="dxa"/>
-              <w:start w:w="120" w:type="dxa"/>
-              <w:bottom w:w="100" w:type="dxa"/>
-              <w:end w:w="120" w:type="dxa"/>
-            </w:tcMar>
-            <w:shd w:fill="1F4E78"/>
-          </w:tcPr>
-          <w:p>
-            <w:pPr>
-              <w:spacing w:after="0"/>
-              <w:jc w:val="center"/>
-            </w:pPr>
-            <w:r>
-              <w:rPr>
-                <w:rFonts w:ascii="TH Sarabun New" w:hAnsi="TH Sarabun New" w:eastAsia="TH Sarabun New"/>
-                <w:b/>
-                <w:color w:val="FFFFFF"/>
-                <w:sz w:val="28"/>
-              </w:rPr>
-              <w:t>3.2.</w:t>
-            </w:r>
-          </w:p>
-        </w:tc>
-        <w:tc>
-          <w:tcPr>
-            <w:tcW w:type="dxa" w:w="4762"/>
-            <w:vAlign w:val="center"/>
-            <w:tcMar>
-              <w:top w:w="100" w:type="dxa"/>
-              <w:start w:w="120" w:type="dxa"/>
-              <w:bottom w:w="100" w:type="dxa"/>
-              <w:end w:w="120" w:type="dxa"/>
-            </w:tcMar>
-            <w:shd w:fill="1F4E78"/>
-          </w:tcPr>
-          <w:p>
-            <w:pPr>
-              <w:spacing w:after="0"/>
-              <w:jc w:val="left"/>
-            </w:pPr>
-            <w:r>
-              <w:rPr>
-                <w:rFonts w:ascii="TH Sarabun New" w:hAnsi="TH Sarabun New" w:eastAsia="TH Sarabun New"/>
-                <w:b/>
-                <w:color w:val="FFFFFF"/>
-                <w:sz w:val="28"/>
-              </w:rPr>
-              <w:t>จำลองสถานการณ์</w:t>
-            </w:r>
-          </w:p>
-        </w:tc>
-      </w:tr>
-      <w:tr>
-        <w:tc>
-          <w:tcPr>
-            <w:tcW w:type="dxa" w:w="4762"/>
-            <w:vAlign w:val="center"/>
-            <w:tcMar>
-              <w:top w:w="100" w:type="dxa"/>
-              <w:start w:w="120" w:type="dxa"/>
-              <w:bottom w:w="100" w:type="dxa"/>
-              <w:end w:w="120" w:type="dxa"/>
-            </w:tcMar>
-            <w:shd w:fill="FFFFFF"/>
-          </w:tcPr>
-          <w:p>
-            <w:pPr>
-              <w:spacing w:after="0"/>
-              <w:jc w:val="center"/>
-            </w:pPr>
-            <w:r>
-              <w:rPr>
-                <w:rFonts w:ascii="TH Sarabun New" w:hAnsi="TH Sarabun New" w:eastAsia="TH Sarabun New"/>
-                <w:b w:val="0"/>
-                <w:color w:val="000000"/>
-                <w:sz w:val="28"/>
-              </w:rPr>
-              <w:t>1.</w:t>
-            </w:r>
-          </w:p>
-        </w:tc>
-        <w:tc>
-          <w:tcPr>
-            <w:tcW w:type="dxa" w:w="4762"/>
-            <w:vAlign w:val="center"/>
-            <w:tcMar>
-              <w:top w:w="100" w:type="dxa"/>
-              <w:start w:w="120" w:type="dxa"/>
-              <w:bottom w:w="100" w:type="dxa"/>
-              <w:end w:w="120" w:type="dxa"/>
-            </w:tcMar>
-            <w:shd w:fill="FFFFFF"/>
-          </w:tcPr>
-          <w:p>
-            <w:pPr>
-              <w:spacing w:after="0"/>
-              <w:jc w:val="left"/>
-            </w:pPr>
-            <w:r>
-              <w:rPr>
-                <w:rFonts w:ascii="TH Sarabun New" w:hAnsi="TH Sarabun New" w:eastAsia="TH Sarabun New"/>
-                <w:b w:val="0"/>
-                <w:color w:val="000000"/>
-                <w:sz w:val="28"/>
-              </w:rPr>
-              <w:t>เลือก “จำลองสถานการณ์” (ขณะนี้รองรับน้ำท่วม)</w:t>
-            </w:r>
-          </w:p>
-        </w:tc>
-      </w:tr>
-      <w:tr>
-        <w:tc>
-          <w:tcPr>
-            <w:tcW w:type="dxa" w:w="4762"/>
-            <w:vAlign w:val="center"/>
-            <w:tcMar>
-              <w:top w:w="100" w:type="dxa"/>
-              <w:start w:w="120" w:type="dxa"/>
-              <w:bottom w:w="100" w:type="dxa"/>
-              <w:end w:w="120" w:type="dxa"/>
-            </w:tcMar>
-            <w:shd w:fill="EDF3F8"/>
-          </w:tcPr>
-          <w:p>
-            <w:pPr>
-              <w:spacing w:after="0"/>
-              <w:jc w:val="center"/>
-            </w:pPr>
-            <w:r>
-              <w:rPr>
-                <w:rFonts w:ascii="TH Sarabun New" w:hAnsi="TH Sarabun New" w:eastAsia="TH Sarabun New"/>
-                <w:b w:val="0"/>
-                <w:color w:val="000000"/>
-                <w:sz w:val="28"/>
-              </w:rPr>
-              <w:t>2.</w:t>
-            </w:r>
-          </w:p>
-        </w:tc>
-        <w:tc>
-          <w:tcPr>
-            <w:tcW w:type="dxa" w:w="4762"/>
-            <w:vAlign w:val="center"/>
-            <w:tcMar>
-              <w:top w:w="100" w:type="dxa"/>
-              <w:start w:w="120" w:type="dxa"/>
-              <w:bottom w:w="100" w:type="dxa"/>
-              <w:end w:w="120" w:type="dxa"/>
-            </w:tcMar>
-            <w:shd w:fill="EDF3F8"/>
-          </w:tcPr>
-          <w:p>
-            <w:pPr>
-              <w:spacing w:after="0"/>
-              <w:jc w:val="left"/>
-            </w:pPr>
-            <w:r>
-              <w:rPr>
-                <w:rFonts w:ascii="TH Sarabun New" w:hAnsi="TH Sarabun New" w:eastAsia="TH Sarabun New"/>
-                <w:b w:val="0"/>
-                <w:color w:val="000000"/>
-                <w:sz w:val="28"/>
-              </w:rPr>
-              <w:t>กำหนด “ระดับน้ำเพิ่มขึ้น (ซม.)” และ “ปริมาณน้ำฝน (มม.)”</w:t>
-            </w:r>
-          </w:p>
-        </w:tc>
-      </w:tr>
-      <w:tr>
-        <w:tc>
-          <w:tcPr>
-            <w:tcW w:type="dxa" w:w="4762"/>
-            <w:vAlign w:val="center"/>
-            <w:tcMar>
-              <w:top w:w="100" w:type="dxa"/>
-              <w:start w:w="120" w:type="dxa"/>
-              <w:bottom w:w="100" w:type="dxa"/>
-              <w:end w:w="120" w:type="dxa"/>
-            </w:tcMar>
-            <w:shd w:fill="FFFFFF"/>
-          </w:tcPr>
-          <w:p>
-            <w:pPr>
-              <w:spacing w:after="0"/>
-              <w:jc w:val="center"/>
-            </w:pPr>
-            <w:r>
-              <w:rPr>
-                <w:rFonts w:ascii="TH Sarabun New" w:hAnsi="TH Sarabun New" w:eastAsia="TH Sarabun New"/>
-                <w:b w:val="0"/>
-                <w:color w:val="000000"/>
-                <w:sz w:val="28"/>
-              </w:rPr>
-              <w:t>3.</w:t>
-            </w:r>
-          </w:p>
-        </w:tc>
-        <w:tc>
-          <w:tcPr>
-            <w:tcW w:type="dxa" w:w="4762"/>
-            <w:vAlign w:val="center"/>
-            <w:tcMar>
-              <w:top w:w="100" w:type="dxa"/>
-              <w:start w:w="120" w:type="dxa"/>
-              <w:bottom w:w="100" w:type="dxa"/>
-              <w:end w:w="120" w:type="dxa"/>
-            </w:tcMar>
-            <w:shd w:fill="FFFFFF"/>
-          </w:tcPr>
-          <w:p>
-            <w:pPr>
-              <w:spacing w:after="0"/>
-              <w:jc w:val="left"/>
-            </w:pPr>
-            <w:r>
-              <w:rPr>
-                <w:rFonts w:ascii="TH Sarabun New" w:hAnsi="TH Sarabun New" w:eastAsia="TH Sarabun New"/>
-                <w:b w:val="0"/>
-                <w:color w:val="000000"/>
-                <w:sz w:val="28"/>
-              </w:rPr>
-              <w:t>เลือก “ปักจุดเริ่มต้นและจำลอง” แล้วคลิกจุดบนแผนที่ ระบบใช้ความสูงภูมิประเทศคำนวณพื้นที่น้ำท่วม</w:t>
-            </w:r>
-          </w:p>
-        </w:tc>
-      </w:tr>
-      <w:tr>
-        <w:tc>
-          <w:tcPr>
-            <w:tcW w:type="dxa" w:w="4762"/>
-            <w:vAlign w:val="center"/>
-            <w:tcMar>
-              <w:top w:w="100" w:type="dxa"/>
-              <w:start w:w="120" w:type="dxa"/>
-              <w:bottom w:w="100" w:type="dxa"/>
-              <w:end w:w="120" w:type="dxa"/>
-            </w:tcMar>
-            <w:shd w:fill="EDF3F8"/>
-          </w:tcPr>
-          <w:p>
-            <w:pPr>
-              <w:spacing w:after="0"/>
-              <w:jc w:val="center"/>
-            </w:pPr>
-            <w:r>
-              <w:rPr>
-                <w:rFonts w:ascii="TH Sarabun New" w:hAnsi="TH Sarabun New" w:eastAsia="TH Sarabun New"/>
-                <w:b w:val="0"/>
-                <w:color w:val="000000"/>
-                <w:sz w:val="28"/>
-              </w:rPr>
-              <w:t>4.</w:t>
-            </w:r>
-          </w:p>
-        </w:tc>
-        <w:tc>
-          <w:tcPr>
-            <w:tcW w:type="dxa" w:w="4762"/>
-            <w:vAlign w:val="center"/>
-            <w:tcMar>
-              <w:top w:w="100" w:type="dxa"/>
-              <w:start w:w="120" w:type="dxa"/>
-              <w:bottom w:w="100" w:type="dxa"/>
-              <w:end w:w="120" w:type="dxa"/>
-            </w:tcMar>
-            <w:shd w:fill="EDF3F8"/>
-          </w:tcPr>
-          <w:p>
-            <w:pPr>
-              <w:spacing w:after="0"/>
-              <w:jc w:val="left"/>
-            </w:pPr>
-            <w:r>
-              <w:rPr>
-                <w:rFonts w:ascii="TH Sarabun New" w:hAnsi="TH Sarabun New" w:eastAsia="TH Sarabun New"/>
-                <w:b w:val="0"/>
-                <w:color w:val="000000"/>
-                <w:sz w:val="28"/>
-              </w:rPr>
-              <w:t>เลือก “ล้างพื้นที่จำลอง” เมื่อต้องการเริ่มใหม่</w:t>
-            </w:r>
-          </w:p>
-        </w:tc>
-      </w:tr>
-    </w:tbl>
     <w:p>
       <w:pPr>
-        <w:spacing w:after="0"/>
-      </w:pPr>
+        <w:ind w:left="425" w:hanging="312"/>
+      </w:pPr>
+      <w:r>
+        <w:t>4.  อ่าน “ผลการประเมินพื้นที่”: พื้นที่ได้รับผลกระทบ (ตร.กม./ไร่/ตร.ม.), ประชากรและครัวเรือนโดยประมาณ, กฎที่ผ่านเงื่อนไข, ทรัพยากรที่ต้องใช้เทียบกับที่มี, สถานที่สำคัญที่ได้รับผลกระทบ</w:t>
+      </w:r>
+    </w:p>
+    <w:p>
+      <w:pPr>
+        <w:pStyle w:val="Heading3"/>
+      </w:pPr>
+      <w:r>
+        <w:t>การจำลองสถานการณ์</w:t>
+      </w:r>
+    </w:p>
+    <w:p>
+      <w:pPr>
+        <w:ind w:left="425" w:hanging="312"/>
+      </w:pPr>
+      <w:r>
+        <w:t>1.  เลือก “จำลองสถานการณ์” (ขณะนี้รองรับน้ำท่วม)</w:t>
+      </w:r>
+    </w:p>
+    <w:p>
+      <w:pPr>
+        <w:ind w:left="425" w:hanging="312"/>
+      </w:pPr>
+      <w:r>
+        <w:t>2.  กำหนด “ระดับน้ำเพิ่มขึ้น (ซม.)” และ “ปริมาณน้ำฝน (มม.)”</w:t>
+      </w:r>
+    </w:p>
+    <w:p>
+      <w:pPr>
+        <w:ind w:left="425" w:hanging="312"/>
+      </w:pPr>
+      <w:r>
+        <w:t>3.  เลือก “ปักจุดเริ่มต้นและจำลอง” แล้วคลิกจุดบนแผนที่ ระบบใช้ความสูงภูมิประเทศคำนวณพื้นที่น้ำท่วม</w:t>
+      </w:r>
+    </w:p>
+    <w:p>
+      <w:pPr>
+        <w:ind w:left="425" w:hanging="312"/>
+      </w:pPr>
+      <w:r>
+        <w:t>4.  เลือก “ล้างพื้นที่จำลอง” เมื่อต้องการเริ่มใหม่</w:t>
+      </w:r>
     </w:p>
     <w:p>
       <w:pPr>
@@ -4318,50 +3735,50 @@
     </w:p>
     <w:p>
       <w:pPr>
-        <w:pStyle w:val="ListNumber"/>
+        <w:ind w:left="425" w:hanging="312"/>
       </w:pPr>
       <w:r>
-        <w:t>เลือกชุดข้อมูลแล้วเลือก “⇧ นำเข้าไฟล์” ครั้งแรกให้เลือก “ดาวน์โหลด Template” เพื่อได้ไฟล์หัวคอลัมน์ภาษาไทย</w:t>
+        <w:t>1.  เลือกชุดข้อมูลแล้วเลือก “⇧ นำเข้าไฟล์” ครั้งแรกให้เลือก “ดาวน์โหลด Template” เพื่อได้ไฟล์หัวคอลัมน์ภาษาไทย</w:t>
       </w:r>
     </w:p>
     <w:p>
       <w:pPr>
-        <w:pStyle w:val="ListNumber"/>
+        <w:ind w:left="425" w:hanging="312"/>
       </w:pPr>
       <w:r>
-        <w:t>อัปโหลด ไฟล์ CSV / XLS / XLSX / PDF ไม่เกิน 20 MB และ 25,000 แถว</w:t>
+        <w:t>2.  อัปโหลด ไฟล์ CSV / XLS / XLSX / PDF ไม่เกิน 20 MB และ 25,000 แถว</w:t>
       </w:r>
     </w:p>
     <w:p>
       <w:pPr>
-        <w:pStyle w:val="ListNumber"/>
+        <w:ind w:left="425" w:hanging="312"/>
       </w:pPr>
       <w:r>
-        <w:t>จับคู่ข้อมูล ระบบจับคู่คอลัมน์ให้อัตโนมัติ ตรวจและแก้ได้</w:t>
+        <w:t>3.  จับคู่ข้อมูล ระบบจับคู่คอลัมน์ให้อัตโนมัติ ตรวจและแก้ได้</w:t>
       </w:r>
     </w:p>
     <w:p>
       <w:pPr>
-        <w:pStyle w:val="ListNumber"/>
+        <w:ind w:left="425" w:hanging="312"/>
       </w:pPr>
       <w:r>
-        <w:t>ตรวจสอบ ดูข้อผิดพลาด (แสดงสูงสุด 30 รายการ) แก้ในไฟล์แล้วอัปโหลดใหม่หากจำเป็น</w:t>
+        <w:t>4.  ตรวจสอบ ดูข้อผิดพลาด (แสดงสูงสุด 30 รายการ) แก้ในไฟล์แล้วอัปโหลดใหม่หากจำเป็น</w:t>
       </w:r>
     </w:p>
     <w:p>
       <w:pPr>
-        <w:pStyle w:val="ListNumber"/>
+        <w:ind w:left="425" w:hanging="312"/>
       </w:pPr>
       <w:r>
-        <w:t>ตัวอย่างข้อมูล ดูข้อมูลก่อนบันทึก</w:t>
+        <w:t>5.  ตัวอย่างข้อมูล ดูข้อมูลก่อนบันทึก</w:t>
       </w:r>
     </w:p>
     <w:p>
       <w:pPr>
-        <w:pStyle w:val="ListNumber"/>
+        <w:ind w:left="425" w:hanging="312"/>
       </w:pPr>
       <w:r>
-        <w:t>รุ่นข้อมูลและชั้นข้อมูล เลือก “ใช้ข้อมูลจากไฟล์แทนข้อมูลเดิม” หรือ “เพิ่มข้อมูลจากไฟล์ต่อจากข้อมูลเดิม” ตั้งชื่อรุ่น และเลือกว่าจะแสดงบนแผนที่หรือไม่ แล้วเลือก “เสร็จสิ้น”</w:t>
+        <w:t>6.  รุ่นข้อมูลและชั้นข้อมูล เลือก “ใช้ข้อมูลจากไฟล์แทนข้อมูลเดิม” หรือ “เพิ่มข้อมูลจากไฟล์ต่อจากข้อมูลเดิม” ตั้งชื่อรุ่น และเลือกว่าจะแสดงบนแผนที่หรือไม่ แล้วเลือก “เสร็จสิ้น”</w:t>
       </w:r>
     </w:p>
     <w:p>
@@ -4380,319 +3797,45 @@
         <w:t>การเพิ่มและแก้ไขข้อมูลรายรายการ</w:t>
       </w:r>
     </w:p>
-    <w:tbl>
-      <w:tblPr>
-        <w:tblW w:type="auto" w:w="0"/>
-        <w:jc w:val="center"/>
-        <w:tblLook w:firstColumn="1" w:firstRow="1" w:lastColumn="0" w:lastRow="0" w:noHBand="0" w:noVBand="1" w:val="04A0"/>
-        <w:tblBorders>
-          <w:top w:val="single" w:sz="4" w:color="D9D9D9"/>
-          <w:left w:val="single" w:sz="4" w:color="D9D9D9"/>
-          <w:bottom w:val="single" w:sz="4" w:color="D9D9D9"/>
-          <w:right w:val="single" w:sz="4" w:color="D9D9D9"/>
-          <w:insideH w:val="single" w:sz="4" w:color="D9D9D9"/>
-          <w:insideV w:val="single" w:sz="4" w:color="D9D9D9"/>
-        </w:tblBorders>
-      </w:tblPr>
-      <w:tblGrid>
-        <w:gridCol w:w="4762"/>
-        <w:gridCol w:w="4762"/>
-      </w:tblGrid>
-      <w:tr>
-        <w:tc>
-          <w:tcPr>
-            <w:tcW w:type="dxa" w:w="4762"/>
-            <w:vAlign w:val="center"/>
-            <w:tcMar>
-              <w:top w:w="100" w:type="dxa"/>
-              <w:start w:w="120" w:type="dxa"/>
-              <w:bottom w:w="100" w:type="dxa"/>
-              <w:end w:w="120" w:type="dxa"/>
-            </w:tcMar>
-            <w:shd w:fill="1F4E78"/>
-          </w:tcPr>
-          <w:p>
-            <w:pPr>
-              <w:spacing w:after="0"/>
-              <w:jc w:val="center"/>
-            </w:pPr>
-            <w:r>
-              <w:rPr>
-                <w:rFonts w:ascii="TH Sarabun New" w:hAnsi="TH Sarabun New" w:eastAsia="TH Sarabun New"/>
-                <w:b/>
-                <w:color w:val="FFFFFF"/>
-                <w:sz w:val="28"/>
-              </w:rPr>
-              <w:t>•</w:t>
-            </w:r>
-          </w:p>
-        </w:tc>
-        <w:tc>
-          <w:tcPr>
-            <w:tcW w:type="dxa" w:w="4762"/>
-            <w:vAlign w:val="center"/>
-            <w:tcMar>
-              <w:top w:w="100" w:type="dxa"/>
-              <w:start w:w="120" w:type="dxa"/>
-              <w:bottom w:w="100" w:type="dxa"/>
-              <w:end w:w="120" w:type="dxa"/>
-            </w:tcMar>
-            <w:shd w:fill="1F4E78"/>
-          </w:tcPr>
-          <w:p>
-            <w:pPr>
-              <w:spacing w:after="0"/>
-              <w:jc w:val="left"/>
-            </w:pPr>
-            <w:r>
-              <w:rPr>
-                <w:rFonts w:ascii="TH Sarabun New" w:hAnsi="TH Sarabun New" w:eastAsia="TH Sarabun New"/>
-                <w:b/>
-                <w:color w:val="FFFFFF"/>
-                <w:sz w:val="28"/>
-              </w:rPr>
-              <w:t>เลือก “＋ เพิ่มข้อมูลด้วยตนเอง” เพื่อกรอกฟอร์ม หน่วยงานปักหมุดบนแผนที่ได้ ขอบเขตหมู่บ้านวาดบนแผนที่หรืออัปโหลด GeoJSON ได้</w:t>
-            </w:r>
-          </w:p>
-        </w:tc>
-      </w:tr>
-      <w:tr>
-        <w:tc>
-          <w:tcPr>
-            <w:tcW w:type="dxa" w:w="4762"/>
-            <w:vAlign w:val="center"/>
-            <w:tcMar>
-              <w:top w:w="100" w:type="dxa"/>
-              <w:start w:w="120" w:type="dxa"/>
-              <w:bottom w:w="100" w:type="dxa"/>
-              <w:end w:w="120" w:type="dxa"/>
-            </w:tcMar>
-            <w:shd w:fill="FFFFFF"/>
-          </w:tcPr>
-          <w:p>
-            <w:pPr>
-              <w:spacing w:after="0"/>
-              <w:jc w:val="center"/>
-            </w:pPr>
-            <w:r>
-              <w:rPr>
-                <w:rFonts w:ascii="TH Sarabun New" w:hAnsi="TH Sarabun New" w:eastAsia="TH Sarabun New"/>
-                <w:b w:val="0"/>
-                <w:color w:val="000000"/>
-                <w:sz w:val="28"/>
-              </w:rPr>
-              <w:t>•</w:t>
-            </w:r>
-          </w:p>
-        </w:tc>
-        <w:tc>
-          <w:tcPr>
-            <w:tcW w:type="dxa" w:w="4762"/>
-            <w:vAlign w:val="center"/>
-            <w:tcMar>
-              <w:top w:w="100" w:type="dxa"/>
-              <w:start w:w="120" w:type="dxa"/>
-              <w:bottom w:w="100" w:type="dxa"/>
-              <w:end w:w="120" w:type="dxa"/>
-            </w:tcMar>
-            <w:shd w:fill="FFFFFF"/>
-          </w:tcPr>
-          <w:p>
-            <w:pPr>
-              <w:spacing w:after="0"/>
-              <w:jc w:val="left"/>
-            </w:pPr>
-            <w:r>
-              <w:rPr>
-                <w:rFonts w:ascii="TH Sarabun New" w:hAnsi="TH Sarabun New" w:eastAsia="TH Sarabun New"/>
-                <w:b w:val="0"/>
-                <w:color w:val="000000"/>
-                <w:sz w:val="28"/>
-              </w:rPr>
-              <w:t>แท็บ “ข้อมูลปัจจุบัน” ค้นหา แก้ไข ลบทีละแถว</w:t>
-            </w:r>
-          </w:p>
-        </w:tc>
-      </w:tr>
-      <w:tr>
-        <w:tc>
-          <w:tcPr>
-            <w:tcW w:type="dxa" w:w="4762"/>
-            <w:vAlign w:val="center"/>
-            <w:tcMar>
-              <w:top w:w="100" w:type="dxa"/>
-              <w:start w:w="120" w:type="dxa"/>
-              <w:bottom w:w="100" w:type="dxa"/>
-              <w:end w:w="120" w:type="dxa"/>
-            </w:tcMar>
-            <w:shd w:fill="EDF3F8"/>
-          </w:tcPr>
-          <w:p>
-            <w:pPr>
-              <w:spacing w:after="0"/>
-              <w:jc w:val="center"/>
-            </w:pPr>
-            <w:r>
-              <w:rPr>
-                <w:rFonts w:ascii="TH Sarabun New" w:hAnsi="TH Sarabun New" w:eastAsia="TH Sarabun New"/>
-                <w:b w:val="0"/>
-                <w:color w:val="000000"/>
-                <w:sz w:val="28"/>
-              </w:rPr>
-              <w:t>•</w:t>
-            </w:r>
-          </w:p>
-        </w:tc>
-        <w:tc>
-          <w:tcPr>
-            <w:tcW w:type="dxa" w:w="4762"/>
-            <w:vAlign w:val="center"/>
-            <w:tcMar>
-              <w:top w:w="100" w:type="dxa"/>
-              <w:start w:w="120" w:type="dxa"/>
-              <w:bottom w:w="100" w:type="dxa"/>
-              <w:end w:w="120" w:type="dxa"/>
-            </w:tcMar>
-            <w:shd w:fill="EDF3F8"/>
-          </w:tcPr>
-          <w:p>
-            <w:pPr>
-              <w:spacing w:after="0"/>
-              <w:jc w:val="left"/>
-            </w:pPr>
-            <w:r>
-              <w:rPr>
-                <w:rFonts w:ascii="TH Sarabun New" w:hAnsi="TH Sarabun New" w:eastAsia="TH Sarabun New"/>
-                <w:b w:val="0"/>
-                <w:color w:val="000000"/>
-                <w:sz w:val="28"/>
-              </w:rPr>
-              <w:t>ประชากร: เลือก “จับคู่ข้อมูลประชากรกับขอบเขตหมู่บ้าน” เพื่อผูกตามรหัสหมู่บ้านหรือตำบล + หมู่ที่</w:t>
-            </w:r>
-          </w:p>
-        </w:tc>
-      </w:tr>
-      <w:tr>
-        <w:tc>
-          <w:tcPr>
-            <w:tcW w:type="dxa" w:w="4762"/>
-            <w:vAlign w:val="center"/>
-            <w:tcMar>
-              <w:top w:w="100" w:type="dxa"/>
-              <w:start w:w="120" w:type="dxa"/>
-              <w:bottom w:w="100" w:type="dxa"/>
-              <w:end w:w="120" w:type="dxa"/>
-            </w:tcMar>
-            <w:shd w:fill="FFFFFF"/>
-          </w:tcPr>
-          <w:p>
-            <w:pPr>
-              <w:spacing w:after="0"/>
-              <w:jc w:val="center"/>
-            </w:pPr>
-            <w:r>
-              <w:rPr>
-                <w:rFonts w:ascii="TH Sarabun New" w:hAnsi="TH Sarabun New" w:eastAsia="TH Sarabun New"/>
-                <w:b w:val="0"/>
-                <w:color w:val="000000"/>
-                <w:sz w:val="28"/>
-              </w:rPr>
-              <w:t>•</w:t>
-            </w:r>
-          </w:p>
-        </w:tc>
-        <w:tc>
-          <w:tcPr>
-            <w:tcW w:type="dxa" w:w="4762"/>
-            <w:vAlign w:val="center"/>
-            <w:tcMar>
-              <w:top w:w="100" w:type="dxa"/>
-              <w:start w:w="120" w:type="dxa"/>
-              <w:bottom w:w="100" w:type="dxa"/>
-              <w:end w:w="120" w:type="dxa"/>
-            </w:tcMar>
-            <w:shd w:fill="FFFFFF"/>
-          </w:tcPr>
-          <w:p>
-            <w:pPr>
-              <w:spacing w:after="0"/>
-              <w:jc w:val="left"/>
-            </w:pPr>
-            <w:r>
-              <w:rPr>
-                <w:rFonts w:ascii="TH Sarabun New" w:hAnsi="TH Sarabun New" w:eastAsia="TH Sarabun New"/>
-                <w:b w:val="0"/>
-                <w:color w:val="000000"/>
-                <w:sz w:val="28"/>
-              </w:rPr>
-              <w:t>วัสดุสิ้นเปลือง: เลือก “บันทึกความเคลื่อนไหว” เลือก รับเข้า / เบิกออก / คืนเข้า / ปรับยอดจากการตรวจนับ ดูประวัติได้ใน “ประวัติรับเข้า–เบิกออก”</w:t>
-            </w:r>
-          </w:p>
-        </w:tc>
-      </w:tr>
-      <w:tr>
-        <w:tc>
-          <w:tcPr>
-            <w:tcW w:type="dxa" w:w="4762"/>
-            <w:vAlign w:val="center"/>
-            <w:tcMar>
-              <w:top w:w="100" w:type="dxa"/>
-              <w:start w:w="120" w:type="dxa"/>
-              <w:bottom w:w="100" w:type="dxa"/>
-              <w:end w:w="120" w:type="dxa"/>
-            </w:tcMar>
-            <w:shd w:fill="EDF3F8"/>
-          </w:tcPr>
-          <w:p>
-            <w:pPr>
-              <w:spacing w:after="0"/>
-              <w:jc w:val="center"/>
-            </w:pPr>
-            <w:r>
-              <w:rPr>
-                <w:rFonts w:ascii="TH Sarabun New" w:hAnsi="TH Sarabun New" w:eastAsia="TH Sarabun New"/>
-                <w:b w:val="0"/>
-                <w:color w:val="000000"/>
-                <w:sz w:val="28"/>
-              </w:rPr>
-              <w:t>•</w:t>
-            </w:r>
-          </w:p>
-        </w:tc>
-        <w:tc>
-          <w:tcPr>
-            <w:tcW w:type="dxa" w:w="4762"/>
-            <w:vAlign w:val="center"/>
-            <w:tcMar>
-              <w:top w:w="100" w:type="dxa"/>
-              <w:start w:w="120" w:type="dxa"/>
-              <w:bottom w:w="100" w:type="dxa"/>
-              <w:end w:w="120" w:type="dxa"/>
-            </w:tcMar>
-            <w:shd w:fill="EDF3F8"/>
-          </w:tcPr>
-          <w:p>
-            <w:pPr>
-              <w:spacing w:after="0"/>
-              <w:jc w:val="left"/>
-            </w:pPr>
-            <w:r>
-              <w:rPr>
-                <w:rFonts w:ascii="TH Sarabun New" w:hAnsi="TH Sarabun New" w:eastAsia="TH Sarabun New"/>
-                <w:b w:val="0"/>
-                <w:color w:val="000000"/>
-                <w:sz w:val="28"/>
-              </w:rPr>
-              <w:t>เปิด “แสดงในชั้นข้อมูล” เพื่อให้ชุดข้อมูลที่มีพิกัดแสดงบนแผนที่</w:t>
-            </w:r>
-          </w:p>
-        </w:tc>
-      </w:tr>
-    </w:tbl>
     <w:p>
       <w:pPr>
-        <w:spacing w:after="0"/>
-      </w:pPr>
+        <w:ind w:left="425" w:hanging="255"/>
+      </w:pPr>
+      <w:r>
+        <w:t>•  เลือก “＋ เพิ่มข้อมูลด้วยตนเอง” เพื่อกรอกฟอร์ม หน่วยงานปักหมุดบนแผนที่ได้ ขอบเขตหมู่บ้านวาดบนแผนที่หรืออัปโหลด GeoJSON ได้</w:t>
+      </w:r>
+    </w:p>
+    <w:p>
+      <w:pPr>
+        <w:ind w:left="425" w:hanging="255"/>
+      </w:pPr>
+      <w:r>
+        <w:t>•  แท็บ “ข้อมูลปัจจุบัน” ค้นหา แก้ไข ลบทีละแถว</w:t>
+      </w:r>
+    </w:p>
+    <w:p>
+      <w:pPr>
+        <w:ind w:left="425" w:hanging="255"/>
+      </w:pPr>
+      <w:r>
+        <w:t>•  ประชากร: เลือก “จับคู่ข้อมูลประชากรกับขอบเขตหมู่บ้าน” เพื่อผูกตามรหัสหมู่บ้านหรือตำบล + หมู่ที่</w:t>
+      </w:r>
+    </w:p>
+    <w:p>
+      <w:pPr>
+        <w:ind w:left="425" w:hanging="255"/>
+      </w:pPr>
+      <w:r>
+        <w:t>•  วัสดุสิ้นเปลือง: เลือก “บันทึกความเคลื่อนไหว” เลือก รับเข้า / เบิกออก / คืนเข้า / ปรับยอดจากการตรวจนับ ดูประวัติได้ใน “ประวัติรับเข้า–เบิกออก”</w:t>
+      </w:r>
+    </w:p>
+    <w:p>
+      <w:pPr>
+        <w:ind w:left="425" w:hanging="255"/>
+      </w:pPr>
+      <w:r>
+        <w:t>•  เปิด “แสดงในชั้นข้อมูล” เพื่อให้ชุดข้อมูลที่มีพิกัดแสดงบนแผนที่</w:t>
+      </w:r>
     </w:p>
     <w:p>
       <w:pPr>
@@ -4702,145 +3845,21 @@
         <w:t>รุ่นข้อมูลและประวัติ</w:t>
       </w:r>
     </w:p>
-    <w:tbl>
-      <w:tblPr>
-        <w:tblW w:type="auto" w:w="0"/>
-        <w:jc w:val="center"/>
-        <w:tblLook w:firstColumn="1" w:firstRow="1" w:lastColumn="0" w:lastRow="0" w:noHBand="0" w:noVBand="1" w:val="04A0"/>
-        <w:tblBorders>
-          <w:top w:val="single" w:sz="4" w:color="D9D9D9"/>
-          <w:left w:val="single" w:sz="4" w:color="D9D9D9"/>
-          <w:bottom w:val="single" w:sz="4" w:color="D9D9D9"/>
-          <w:right w:val="single" w:sz="4" w:color="D9D9D9"/>
-          <w:insideH w:val="single" w:sz="4" w:color="D9D9D9"/>
-          <w:insideV w:val="single" w:sz="4" w:color="D9D9D9"/>
-        </w:tblBorders>
-      </w:tblPr>
-      <w:tblGrid>
-        <w:gridCol w:w="4762"/>
-        <w:gridCol w:w="4762"/>
-      </w:tblGrid>
-      <w:tr>
-        <w:tc>
-          <w:tcPr>
-            <w:tcW w:type="dxa" w:w="4762"/>
-            <w:vAlign w:val="center"/>
-            <w:tcMar>
-              <w:top w:w="100" w:type="dxa"/>
-              <w:start w:w="120" w:type="dxa"/>
-              <w:bottom w:w="100" w:type="dxa"/>
-              <w:end w:w="120" w:type="dxa"/>
-            </w:tcMar>
-            <w:shd w:fill="1F4E78"/>
-          </w:tcPr>
-          <w:p>
-            <w:pPr>
-              <w:spacing w:after="0"/>
-              <w:jc w:val="center"/>
-            </w:pPr>
-            <w:r>
-              <w:rPr>
-                <w:rFonts w:ascii="TH Sarabun New" w:hAnsi="TH Sarabun New" w:eastAsia="TH Sarabun New"/>
-                <w:b/>
-                <w:color w:val="FFFFFF"/>
-                <w:sz w:val="28"/>
-              </w:rPr>
-              <w:t>•</w:t>
-            </w:r>
-          </w:p>
-        </w:tc>
-        <w:tc>
-          <w:tcPr>
-            <w:tcW w:type="dxa" w:w="4762"/>
-            <w:vAlign w:val="center"/>
-            <w:tcMar>
-              <w:top w:w="100" w:type="dxa"/>
-              <w:start w:w="120" w:type="dxa"/>
-              <w:bottom w:w="100" w:type="dxa"/>
-              <w:end w:w="120" w:type="dxa"/>
-            </w:tcMar>
-            <w:shd w:fill="1F4E78"/>
-          </w:tcPr>
-          <w:p>
-            <w:pPr>
-              <w:spacing w:after="0"/>
-              <w:jc w:val="left"/>
-            </w:pPr>
-            <w:r>
-              <w:rPr>
-                <w:rFonts w:ascii="TH Sarabun New" w:hAnsi="TH Sarabun New" w:eastAsia="TH Sarabun New"/>
-                <w:b/>
-                <w:color w:val="FFFFFF"/>
-                <w:sz w:val="28"/>
-              </w:rPr>
-              <w:t>ประวัติรุ่นข้อมูล: ทุกการนำเข้า/แก้ไขสร้างรุ่นใหม่ ดู ดาวน์โหลดไฟล์ต้นฉบับ หรือย้อนกลับไปรุ่นเก่าได้</w:t>
-            </w:r>
-          </w:p>
-        </w:tc>
-      </w:tr>
-      <w:tr>
-        <w:tc>
-          <w:tcPr>
-            <w:tcW w:type="dxa" w:w="4762"/>
-            <w:vAlign w:val="center"/>
-            <w:tcMar>
-              <w:top w:w="100" w:type="dxa"/>
-              <w:start w:w="120" w:type="dxa"/>
-              <w:bottom w:w="100" w:type="dxa"/>
-              <w:end w:w="120" w:type="dxa"/>
-            </w:tcMar>
-            <w:shd w:fill="FFFFFF"/>
-          </w:tcPr>
-          <w:p>
-            <w:pPr>
-              <w:spacing w:after="0"/>
-              <w:jc w:val="center"/>
-            </w:pPr>
-            <w:r>
-              <w:rPr>
-                <w:rFonts w:ascii="TH Sarabun New" w:hAnsi="TH Sarabun New" w:eastAsia="TH Sarabun New"/>
-                <w:b w:val="0"/>
-                <w:color w:val="000000"/>
-                <w:sz w:val="28"/>
-              </w:rPr>
-              <w:t>•</w:t>
-            </w:r>
-          </w:p>
-        </w:tc>
-        <w:tc>
-          <w:tcPr>
-            <w:tcW w:type="dxa" w:w="4762"/>
-            <w:vAlign w:val="center"/>
-            <w:tcMar>
-              <w:top w:w="100" w:type="dxa"/>
-              <w:start w:w="120" w:type="dxa"/>
-              <w:bottom w:w="100" w:type="dxa"/>
-              <w:end w:w="120" w:type="dxa"/>
-            </w:tcMar>
-            <w:shd w:fill="FFFFFF"/>
-          </w:tcPr>
-          <w:p>
-            <w:pPr>
-              <w:spacing w:after="0"/>
-              <w:jc w:val="left"/>
-            </w:pPr>
-            <w:r>
-              <w:rPr>
-                <w:rFonts w:ascii="TH Sarabun New" w:hAnsi="TH Sarabun New" w:eastAsia="TH Sarabun New"/>
-                <w:b w:val="0"/>
-                <w:color w:val="000000"/>
-                <w:sz w:val="28"/>
-              </w:rPr>
-              <w:t>ประวัติการแก้ไข: ใครเพิ่ม แก้ ลบอะไร พร้อมค่าก่อนและหลังแก้</w:t>
-            </w:r>
-          </w:p>
-        </w:tc>
-      </w:tr>
-    </w:tbl>
     <w:p>
       <w:pPr>
-        <w:spacing w:after="0"/>
-      </w:pPr>
+        <w:ind w:left="425" w:hanging="255"/>
+      </w:pPr>
+      <w:r>
+        <w:t>•  ประวัติรุ่นข้อมูล: ทุกการนำเข้า/แก้ไขสร้างรุ่นใหม่ ดู ดาวน์โหลดไฟล์ต้นฉบับ หรือย้อนกลับไปรุ่นเก่าได้</w:t>
+      </w:r>
+    </w:p>
+    <w:p>
+      <w:pPr>
+        <w:ind w:left="425" w:hanging="255"/>
+      </w:pPr>
+      <w:r>
+        <w:t>•  ประวัติการแก้ไข: ใครเพิ่ม แก้ ลบอะไร พร้อมค่าก่อนและหลังแก้</w:t>
+      </w:r>
     </w:p>
     <w:p>
       <w:r>
@@ -4877,6 +3896,14 @@
       </w:pPr>
       <w:r>
         <w:t>รอรับเรื่อง ไปยัง กำลังดำเนินการ ไปยัง เสร็จสิ้น</w:t>
+      </w:r>
+    </w:p>
+    <w:p>
+      <w:pPr>
+        <w:ind w:firstLine="425"/>
+      </w:pPr>
+      <w:r>
+        <w:t>↓ ผู้ดูแลยกระดับได้</w:t>
       </w:r>
     </w:p>
     <w:p>
@@ -4910,493 +3937,69 @@
         <w:t>หน้าเหตุการณ์ทั่วไป: การ์ดสรุปตามสถานะ รายการรับแจ้ง และรายละเอียดเหตุการณ์</w:t>
       </w:r>
     </w:p>
-    <w:tbl>
-      <w:tblPr>
-        <w:tblW w:type="auto" w:w="0"/>
-        <w:jc w:val="center"/>
-        <w:tblLook w:firstColumn="1" w:firstRow="1" w:lastColumn="0" w:lastRow="0" w:noHBand="0" w:noVBand="1" w:val="04A0"/>
-        <w:tblBorders>
-          <w:top w:val="single" w:sz="4" w:color="D9D9D9"/>
-          <w:left w:val="single" w:sz="4" w:color="D9D9D9"/>
-          <w:bottom w:val="single" w:sz="4" w:color="D9D9D9"/>
-          <w:right w:val="single" w:sz="4" w:color="D9D9D9"/>
-          <w:insideH w:val="single" w:sz="4" w:color="D9D9D9"/>
-          <w:insideV w:val="single" w:sz="4" w:color="D9D9D9"/>
-        </w:tblBorders>
-      </w:tblPr>
-      <w:tblGrid>
-        <w:gridCol w:w="4762"/>
-        <w:gridCol w:w="4762"/>
-      </w:tblGrid>
-      <w:tr>
-        <w:tc>
-          <w:tcPr>
-            <w:tcW w:type="dxa" w:w="4762"/>
-            <w:vAlign w:val="center"/>
-            <w:tcMar>
-              <w:top w:w="100" w:type="dxa"/>
-              <w:start w:w="120" w:type="dxa"/>
-              <w:bottom w:w="100" w:type="dxa"/>
-              <w:end w:w="120" w:type="dxa"/>
-            </w:tcMar>
-            <w:shd w:fill="1F4E78"/>
-          </w:tcPr>
-          <w:p>
-            <w:pPr>
-              <w:spacing w:after="0"/>
-              <w:jc w:val="center"/>
-            </w:pPr>
-            <w:r>
-              <w:rPr>
-                <w:rFonts w:ascii="TH Sarabun New" w:hAnsi="TH Sarabun New" w:eastAsia="TH Sarabun New"/>
-                <w:b/>
-                <w:color w:val="FFFFFF"/>
-                <w:sz w:val="28"/>
-              </w:rPr>
-              <w:t>4.1.</w:t>
-            </w:r>
-          </w:p>
-        </w:tc>
-        <w:tc>
-          <w:tcPr>
-            <w:tcW w:type="dxa" w:w="4762"/>
-            <w:vAlign w:val="center"/>
-            <w:tcMar>
-              <w:top w:w="100" w:type="dxa"/>
-              <w:start w:w="120" w:type="dxa"/>
-              <w:bottom w:w="100" w:type="dxa"/>
-              <w:end w:w="120" w:type="dxa"/>
-            </w:tcMar>
-            <w:shd w:fill="1F4E78"/>
-          </w:tcPr>
-          <w:p>
-            <w:pPr>
-              <w:spacing w:after="0"/>
-              <w:jc w:val="left"/>
-            </w:pPr>
-            <w:r>
-              <w:rPr>
-                <w:rFonts w:ascii="TH Sarabun New" w:hAnsi="TH Sarabun New" w:eastAsia="TH Sarabun New"/>
-                <w:b/>
-                <w:color w:val="FFFFFF"/>
-                <w:sz w:val="28"/>
-              </w:rPr>
-              <w:t>เจ้าหน้าที่บันทึกเหตุการณ์</w:t>
-            </w:r>
-          </w:p>
-        </w:tc>
-      </w:tr>
-      <w:tr>
-        <w:tc>
-          <w:tcPr>
-            <w:tcW w:type="dxa" w:w="4762"/>
-            <w:vAlign w:val="center"/>
-            <w:tcMar>
-              <w:top w:w="100" w:type="dxa"/>
-              <w:start w:w="120" w:type="dxa"/>
-              <w:bottom w:w="100" w:type="dxa"/>
-              <w:end w:w="120" w:type="dxa"/>
-            </w:tcMar>
-            <w:shd w:fill="FFFFFF"/>
-          </w:tcPr>
-          <w:p>
-            <w:pPr>
-              <w:spacing w:after="0"/>
-              <w:jc w:val="center"/>
-            </w:pPr>
-            <w:r>
-              <w:rPr>
-                <w:rFonts w:ascii="TH Sarabun New" w:hAnsi="TH Sarabun New" w:eastAsia="TH Sarabun New"/>
-                <w:b w:val="0"/>
-                <w:color w:val="000000"/>
-                <w:sz w:val="28"/>
-              </w:rPr>
-              <w:t>5.</w:t>
-            </w:r>
-          </w:p>
-        </w:tc>
-        <w:tc>
-          <w:tcPr>
-            <w:tcW w:type="dxa" w:w="4762"/>
-            <w:vAlign w:val="center"/>
-            <w:tcMar>
-              <w:top w:w="100" w:type="dxa"/>
-              <w:start w:w="120" w:type="dxa"/>
-              <w:bottom w:w="100" w:type="dxa"/>
-              <w:end w:w="120" w:type="dxa"/>
-            </w:tcMar>
-            <w:shd w:fill="FFFFFF"/>
-          </w:tcPr>
-          <w:p>
-            <w:pPr>
-              <w:spacing w:after="0"/>
-              <w:jc w:val="left"/>
-            </w:pPr>
-            <w:r>
-              <w:rPr>
-                <w:rFonts w:ascii="TH Sarabun New" w:hAnsi="TH Sarabun New" w:eastAsia="TH Sarabun New"/>
-                <w:b w:val="0"/>
-                <w:color w:val="000000"/>
-                <w:sz w:val="28"/>
-              </w:rPr>
-              <w:t>เมนู “เหตุการณ์ทั่วไป” เลือกปุ่ม “บันทึกเหตุการณ์ใหม่”</w:t>
-            </w:r>
-          </w:p>
-        </w:tc>
-      </w:tr>
-      <w:tr>
-        <w:tc>
-          <w:tcPr>
-            <w:tcW w:type="dxa" w:w="4762"/>
-            <w:vAlign w:val="center"/>
-            <w:tcMar>
-              <w:top w:w="100" w:type="dxa"/>
-              <w:start w:w="120" w:type="dxa"/>
-              <w:bottom w:w="100" w:type="dxa"/>
-              <w:end w:w="120" w:type="dxa"/>
-            </w:tcMar>
-            <w:shd w:fill="EDF3F8"/>
-          </w:tcPr>
-          <w:p>
-            <w:pPr>
-              <w:spacing w:after="0"/>
-              <w:jc w:val="center"/>
-            </w:pPr>
-            <w:r>
-              <w:rPr>
-                <w:rFonts w:ascii="TH Sarabun New" w:hAnsi="TH Sarabun New" w:eastAsia="TH Sarabun New"/>
-                <w:b w:val="0"/>
-                <w:color w:val="000000"/>
-                <w:sz w:val="28"/>
-              </w:rPr>
-              <w:t>6.</w:t>
-            </w:r>
-          </w:p>
-        </w:tc>
-        <w:tc>
-          <w:tcPr>
-            <w:tcW w:type="dxa" w:w="4762"/>
-            <w:vAlign w:val="center"/>
-            <w:tcMar>
-              <w:top w:w="100" w:type="dxa"/>
-              <w:start w:w="120" w:type="dxa"/>
-              <w:bottom w:w="100" w:type="dxa"/>
-              <w:end w:w="120" w:type="dxa"/>
-            </w:tcMar>
-            <w:shd w:fill="EDF3F8"/>
-          </w:tcPr>
-          <w:p>
-            <w:pPr>
-              <w:spacing w:after="0"/>
-              <w:jc w:val="left"/>
-            </w:pPr>
-            <w:r>
-              <w:rPr>
-                <w:rFonts w:ascii="TH Sarabun New" w:hAnsi="TH Sarabun New" w:eastAsia="TH Sarabun New"/>
-                <w:b w:val="0"/>
-                <w:color w:val="000000"/>
-                <w:sz w:val="28"/>
-              </w:rPr>
-              <w:t>กรอกชื่อเหตุการณ์ เลือกประเภท (น้ำท่วม ไฟป่า พายุ ดินถล่ม ภัยแล้ง อื่น ๆ)</w:t>
-            </w:r>
-          </w:p>
-        </w:tc>
-      </w:tr>
-      <w:tr>
-        <w:tc>
-          <w:tcPr>
-            <w:tcW w:type="dxa" w:w="4762"/>
-            <w:vAlign w:val="center"/>
-            <w:tcMar>
-              <w:top w:w="100" w:type="dxa"/>
-              <w:start w:w="120" w:type="dxa"/>
-              <w:bottom w:w="100" w:type="dxa"/>
-              <w:end w:w="120" w:type="dxa"/>
-            </w:tcMar>
-            <w:shd w:fill="FFFFFF"/>
-          </w:tcPr>
-          <w:p>
-            <w:pPr>
-              <w:spacing w:after="0"/>
-              <w:jc w:val="center"/>
-            </w:pPr>
-            <w:r>
-              <w:rPr>
-                <w:rFonts w:ascii="TH Sarabun New" w:hAnsi="TH Sarabun New" w:eastAsia="TH Sarabun New"/>
-                <w:b w:val="0"/>
-                <w:color w:val="000000"/>
-                <w:sz w:val="28"/>
-              </w:rPr>
-              <w:t>7.</w:t>
-            </w:r>
-          </w:p>
-        </w:tc>
-        <w:tc>
-          <w:tcPr>
-            <w:tcW w:type="dxa" w:w="4762"/>
-            <w:vAlign w:val="center"/>
-            <w:tcMar>
-              <w:top w:w="100" w:type="dxa"/>
-              <w:start w:w="120" w:type="dxa"/>
-              <w:bottom w:w="100" w:type="dxa"/>
-              <w:end w:w="120" w:type="dxa"/>
-            </w:tcMar>
-            <w:shd w:fill="FFFFFF"/>
-          </w:tcPr>
-          <w:p>
-            <w:pPr>
-              <w:spacing w:after="0"/>
-              <w:jc w:val="left"/>
-            </w:pPr>
-            <w:r>
-              <w:rPr>
-                <w:rFonts w:ascii="TH Sarabun New" w:hAnsi="TH Sarabun New" w:eastAsia="TH Sarabun New"/>
-                <w:b w:val="0"/>
-                <w:color w:val="000000"/>
-                <w:sz w:val="28"/>
-              </w:rPr>
-              <w:t>เลือกระดับความเร่งด่วน</w:t>
-            </w:r>
-          </w:p>
-        </w:tc>
-      </w:tr>
-      <w:tr>
-        <w:tc>
-          <w:tcPr>
-            <w:tcW w:type="dxa" w:w="4762"/>
-            <w:vAlign w:val="center"/>
-            <w:tcMar>
-              <w:top w:w="100" w:type="dxa"/>
-              <w:start w:w="120" w:type="dxa"/>
-              <w:bottom w:w="100" w:type="dxa"/>
-              <w:end w:w="120" w:type="dxa"/>
-            </w:tcMar>
-            <w:shd w:fill="EDF3F8"/>
-          </w:tcPr>
-          <w:p>
-            <w:pPr>
-              <w:spacing w:after="0"/>
-              <w:jc w:val="center"/>
-            </w:pPr>
-            <w:r>
-              <w:rPr>
-                <w:rFonts w:ascii="TH Sarabun New" w:hAnsi="TH Sarabun New" w:eastAsia="TH Sarabun New"/>
-                <w:b w:val="0"/>
-                <w:color w:val="000000"/>
-                <w:sz w:val="28"/>
-              </w:rPr>
-              <w:t>8.</w:t>
-            </w:r>
-          </w:p>
-        </w:tc>
-        <w:tc>
-          <w:tcPr>
-            <w:tcW w:type="dxa" w:w="4762"/>
-            <w:vAlign w:val="center"/>
-            <w:tcMar>
-              <w:top w:w="100" w:type="dxa"/>
-              <w:start w:w="120" w:type="dxa"/>
-              <w:bottom w:w="100" w:type="dxa"/>
-              <w:end w:w="120" w:type="dxa"/>
-            </w:tcMar>
-            <w:shd w:fill="EDF3F8"/>
-          </w:tcPr>
-          <w:p>
-            <w:pPr>
-              <w:spacing w:after="0"/>
-              <w:jc w:val="left"/>
-            </w:pPr>
-            <w:r>
-              <w:rPr>
-                <w:rFonts w:ascii="TH Sarabun New" w:hAnsi="TH Sarabun New" w:eastAsia="TH Sarabun New"/>
-                <w:b w:val="0"/>
-                <w:color w:val="000000"/>
-                <w:sz w:val="28"/>
-              </w:rPr>
-              <w:t>กรอกรายละเอียด ผู้แจ้งเหตุ หมายเลขโทรศัพท์ติดต่อ ผลกระทบเบื้องต้น</w:t>
-            </w:r>
-          </w:p>
-        </w:tc>
-      </w:tr>
-      <w:tr>
-        <w:tc>
-          <w:tcPr>
-            <w:tcW w:type="dxa" w:w="4762"/>
-            <w:vAlign w:val="center"/>
-            <w:tcMar>
-              <w:top w:w="100" w:type="dxa"/>
-              <w:start w:w="120" w:type="dxa"/>
-              <w:bottom w:w="100" w:type="dxa"/>
-              <w:end w:w="120" w:type="dxa"/>
-            </w:tcMar>
-            <w:shd w:fill="FFFFFF"/>
-          </w:tcPr>
-          <w:p>
-            <w:pPr>
-              <w:spacing w:after="0"/>
-              <w:jc w:val="center"/>
-            </w:pPr>
-            <w:r>
-              <w:rPr>
-                <w:rFonts w:ascii="TH Sarabun New" w:hAnsi="TH Sarabun New" w:eastAsia="TH Sarabun New"/>
-                <w:b w:val="0"/>
-                <w:color w:val="000000"/>
-                <w:sz w:val="28"/>
-              </w:rPr>
-              <w:t>9.</w:t>
-            </w:r>
-          </w:p>
-        </w:tc>
-        <w:tc>
-          <w:tcPr>
-            <w:tcW w:type="dxa" w:w="4762"/>
-            <w:vAlign w:val="center"/>
-            <w:tcMar>
-              <w:top w:w="100" w:type="dxa"/>
-              <w:start w:w="120" w:type="dxa"/>
-              <w:bottom w:w="100" w:type="dxa"/>
-              <w:end w:w="120" w:type="dxa"/>
-            </w:tcMar>
-            <w:shd w:fill="FFFFFF"/>
-          </w:tcPr>
-          <w:p>
-            <w:pPr>
-              <w:spacing w:after="0"/>
-              <w:jc w:val="left"/>
-            </w:pPr>
-            <w:r>
-              <w:rPr>
-                <w:rFonts w:ascii="TH Sarabun New" w:hAnsi="TH Sarabun New" w:eastAsia="TH Sarabun New"/>
-                <w:b w:val="0"/>
-                <w:color w:val="000000"/>
-                <w:sz w:val="28"/>
-              </w:rPr>
-              <w:t>คลิกแผนที่เพื่อปักสถานที่เกิดเหตุ แนบรูปได้สูงสุด 8 รูป (JPG/PNG/WebP ไม่เกิน 10 MB)</w:t>
-            </w:r>
-          </w:p>
-        </w:tc>
-      </w:tr>
-      <w:tr>
-        <w:tc>
-          <w:tcPr>
-            <w:tcW w:type="dxa" w:w="4762"/>
-            <w:vAlign w:val="center"/>
-            <w:tcMar>
-              <w:top w:w="100" w:type="dxa"/>
-              <w:start w:w="120" w:type="dxa"/>
-              <w:bottom w:w="100" w:type="dxa"/>
-              <w:end w:w="120" w:type="dxa"/>
-            </w:tcMar>
-            <w:shd w:fill="EDF3F8"/>
-          </w:tcPr>
-          <w:p>
-            <w:pPr>
-              <w:spacing w:after="0"/>
-              <w:jc w:val="center"/>
-            </w:pPr>
-            <w:r>
-              <w:rPr>
-                <w:rFonts w:ascii="TH Sarabun New" w:hAnsi="TH Sarabun New" w:eastAsia="TH Sarabun New"/>
-                <w:b w:val="0"/>
-                <w:color w:val="000000"/>
-                <w:sz w:val="28"/>
-              </w:rPr>
-              <w:t>10.</w:t>
-            </w:r>
-          </w:p>
-        </w:tc>
-        <w:tc>
-          <w:tcPr>
-            <w:tcW w:type="dxa" w:w="4762"/>
-            <w:vAlign w:val="center"/>
-            <w:tcMar>
-              <w:top w:w="100" w:type="dxa"/>
-              <w:start w:w="120" w:type="dxa"/>
-              <w:bottom w:w="100" w:type="dxa"/>
-              <w:end w:w="120" w:type="dxa"/>
-            </w:tcMar>
-            <w:shd w:fill="EDF3F8"/>
-          </w:tcPr>
-          <w:p>
-            <w:pPr>
-              <w:spacing w:after="0"/>
-              <w:jc w:val="left"/>
-            </w:pPr>
-            <w:r>
-              <w:rPr>
-                <w:rFonts w:ascii="TH Sarabun New" w:hAnsi="TH Sarabun New" w:eastAsia="TH Sarabun New"/>
-                <w:b w:val="0"/>
-                <w:color w:val="000000"/>
-                <w:sz w:val="28"/>
-              </w:rPr>
-              <w:t>เหตุที่เกิดไปแล้ว เลือกช่อง “เป็นการบันทึกเหตุการณ์ย้อนหลัง” แล้วระบุวันและเวลา ระบบออกเลขอ้างอิงรูปแบบ INC-พ.ศ.-XXXXXX</w:t>
-            </w:r>
-          </w:p>
-        </w:tc>
-      </w:tr>
-      <w:tr>
-        <w:tc>
-          <w:tcPr>
-            <w:tcW w:type="dxa" w:w="4762"/>
-            <w:vAlign w:val="center"/>
-            <w:tcMar>
-              <w:top w:w="100" w:type="dxa"/>
-              <w:start w:w="120" w:type="dxa"/>
-              <w:bottom w:w="100" w:type="dxa"/>
-              <w:end w:w="120" w:type="dxa"/>
-            </w:tcMar>
-            <w:shd w:fill="FFFFFF"/>
-          </w:tcPr>
-          <w:p>
-            <w:pPr>
-              <w:spacing w:after="0"/>
-              <w:jc w:val="center"/>
-            </w:pPr>
-            <w:r>
-              <w:rPr>
-                <w:rFonts w:ascii="TH Sarabun New" w:hAnsi="TH Sarabun New" w:eastAsia="TH Sarabun New"/>
-                <w:b w:val="0"/>
-                <w:color w:val="000000"/>
-                <w:sz w:val="28"/>
-              </w:rPr>
-              <w:t>4.2.</w:t>
-            </w:r>
-          </w:p>
-        </w:tc>
-        <w:tc>
-          <w:tcPr>
-            <w:tcW w:type="dxa" w:w="4762"/>
-            <w:vAlign w:val="center"/>
-            <w:tcMar>
-              <w:top w:w="100" w:type="dxa"/>
-              <w:start w:w="120" w:type="dxa"/>
-              <w:bottom w:w="100" w:type="dxa"/>
-              <w:end w:w="120" w:type="dxa"/>
-            </w:tcMar>
-            <w:shd w:fill="FFFFFF"/>
-          </w:tcPr>
-          <w:p>
-            <w:pPr>
-              <w:spacing w:after="0"/>
-              <w:jc w:val="left"/>
-            </w:pPr>
-            <w:r>
-              <w:rPr>
-                <w:rFonts w:ascii="TH Sarabun New" w:hAnsi="TH Sarabun New" w:eastAsia="TH Sarabun New"/>
-                <w:b w:val="0"/>
-                <w:color w:val="000000"/>
-                <w:sz w:val="28"/>
-              </w:rPr>
-              <w:t>แบบฟอร์มแจ้งเหตุจากประชาชน</w:t>
-            </w:r>
-          </w:p>
-        </w:tc>
-      </w:tr>
-    </w:tbl>
     <w:p>
       <w:pPr>
-        <w:spacing w:after="0"/>
-      </w:pPr>
+        <w:pStyle w:val="Heading3"/>
+      </w:pPr>
+      <w:r>
+        <w:t>การบันทึกเหตุการณ์โดยเจ้าหน้าที่</w:t>
+      </w:r>
+    </w:p>
+    <w:p>
+      <w:pPr>
+        <w:ind w:left="425" w:hanging="312"/>
+      </w:pPr>
+      <w:r>
+        <w:t>1.  เมนู “เหตุการณ์ทั่วไป” เลือกปุ่ม “บันทึกเหตุการณ์ใหม่”</w:t>
+      </w:r>
+    </w:p>
+    <w:p>
+      <w:pPr>
+        <w:ind w:left="425" w:hanging="312"/>
+      </w:pPr>
+      <w:r>
+        <w:t>2.  กรอกชื่อเหตุการณ์ เลือกประเภท (น้ำท่วม ไฟป่า พายุ ดินถล่ม ภัยแล้ง อื่น ๆ)</w:t>
+      </w:r>
+    </w:p>
+    <w:p>
+      <w:pPr>
+        <w:ind w:left="425" w:hanging="312"/>
+      </w:pPr>
+      <w:r>
+        <w:t>3.  เลือกระดับความเร่งด่วน</w:t>
+      </w:r>
+    </w:p>
+    <w:p>
+      <w:pPr>
+        <w:ind w:left="425" w:hanging="312"/>
+      </w:pPr>
+      <w:r>
+        <w:t>4.  กรอกรายละเอียด ผู้แจ้งเหตุ หมายเลขโทรศัพท์ติดต่อ ผลกระทบเบื้องต้น</w:t>
+      </w:r>
+    </w:p>
+    <w:p>
+      <w:pPr>
+        <w:ind w:left="425" w:hanging="312"/>
+      </w:pPr>
+      <w:r>
+        <w:t>5.  คลิกแผนที่เพื่อปักสถานที่เกิดเหตุ แนบรูปได้สูงสุด 8 รูป (JPG/PNG/WebP ไม่เกิน 10 MB)</w:t>
+      </w:r>
+    </w:p>
+    <w:p>
+      <w:pPr>
+        <w:ind w:left="425" w:hanging="312"/>
+      </w:pPr>
+      <w:r>
+        <w:t>6.  เหตุที่เกิดไปแล้ว เลือกช่อง “เป็นการบันทึกเหตุการณ์ย้อนหลัง” แล้วระบุวันและเวลา ระบบออกเลขอ้างอิงรูปแบบ INC-พ.ศ.-XXXXXX</w:t>
+      </w:r>
+    </w:p>
+    <w:p>
+      <w:pPr>
+        <w:pStyle w:val="Heading3"/>
+      </w:pPr>
+      <w:r>
+        <w:t>แบบฟอร์มแจ้งเหตุสำหรับประชาชน</w:t>
+      </w:r>
     </w:p>
     <w:p>
       <w:pPr>
@@ -5416,82 +4019,82 @@
     </w:p>
     <w:p>
       <w:pPr>
-        <w:pStyle w:val="ListNumber"/>
+        <w:ind w:left="425" w:hanging="312"/>
       </w:pPr>
       <w:r>
-        <w:t>เปิดลิงก์บนมือถือ</w:t>
+        <w:t>1.  เปิดลิงก์บนมือถือ</w:t>
       </w:r>
     </w:p>
     <w:p>
       <w:pPr>
-        <w:pStyle w:val="ListNumber"/>
+        <w:ind w:left="425" w:hanging="312"/>
       </w:pPr>
       <w:r>
-        <w:t>กรอกประเภท ความเร่งด่วน รายละเอียด แนบรูปได้ 8 รูป</w:t>
+        <w:t>2.  กรอกประเภท ความเร่งด่วน รายละเอียด แนบรูปได้ 8 รูป</w:t>
       </w:r>
     </w:p>
     <w:p>
       <w:pPr>
-        <w:pStyle w:val="ListNumber"/>
+        <w:ind w:left="425" w:hanging="312"/>
       </w:pPr>
       <w:r>
-        <w:t>แตะแผนที่หรือเลือก “ใช้ตำแหน่งปัจจุบัน” ตำแหน่งต้องอยู่ในเขต อบต.</w:t>
+        <w:t>3.  แตะแผนที่หรือเลือก “ใช้ตำแหน่งปัจจุบัน” ตำแหน่งต้องอยู่ในเขต อบต.</w:t>
       </w:r>
     </w:p>
     <w:p>
       <w:pPr>
-        <w:pStyle w:val="ListNumber"/>
+        <w:ind w:left="425" w:hanging="312"/>
       </w:pPr>
       <w:r>
-        <w:t>กรอกชื่อผู้แจ้ง หมายเลขโทรศัพท์ติดต่อ และเลือก “ยืนยันว่าข้อมูลที่แจ้งเป็นความจริง และยินยอมให้เจ้าหน้าที่ใช้ข้อมูลเพื่อดำเนินการเกี่ยวกับเหตุการณ์นี้” แล้วเลือกปุ่ม “ส่งข้อมูลแจ้งเหตุ”</w:t>
+        <w:t>4.  กรอกชื่อผู้แจ้ง หมายเลขโทรศัพท์ติดต่อ และเลือก “ยืนยันว่าข้อมูลที่แจ้งเป็นความจริง และยินยอมให้เจ้าหน้าที่ใช้ข้อมูลเพื่อดำเนินการเกี่ยวกับเหตุการณ์นี้” แล้วเลือกปุ่ม “ส่งข้อมูลแจ้งเหตุ”</w:t>
       </w:r>
     </w:p>
     <w:p>
       <w:pPr>
-        <w:pStyle w:val="ListNumber"/>
+        <w:ind w:left="425" w:hanging="312"/>
       </w:pPr>
       <w:r>
-        <w:t>เห็นหน้า “ยืนยันการแจ้งเหตุเรียบร้อยแล้ว” เรื่องเข้าสถานะ “รอรับเรื่อง” ทันที</w:t>
+        <w:t>5.  เห็นหน้า “ยืนยันการแจ้งเหตุเรียบร้อยแล้ว” เรื่องเข้าสถานะ “รอรับเรื่อง” ทันที</w:t>
       </w:r>
     </w:p>
     <w:p>
       <w:pPr>
-        <w:pStyle w:val="ListNumber"/>
+        <w:pStyle w:val="Heading3"/>
       </w:pPr>
       <w:r>
-        <w:t>รับเรื่องและติดตาม</w:t>
+        <w:t>การรับเรื่องและติดตามผล</w:t>
       </w:r>
     </w:p>
     <w:p>
       <w:pPr>
-        <w:pStyle w:val="ListNumber"/>
+        <w:ind w:left="425" w:hanging="312"/>
       </w:pPr>
       <w:r>
-        <w:t>เลือกเหตุการณ์จากรายการ (กรอง ทั้งหมด / รอรับเรื่อง / กำลังดำเนินการ / เสร็จสิ้น)</w:t>
+        <w:t>1.  เลือกเหตุการณ์จากรายการ (กรอง ทั้งหมด / รอรับเรื่อง / กำลังดำเนินการ / เสร็จสิ้น)</w:t>
       </w:r>
     </w:p>
     <w:p>
       <w:pPr>
-        <w:pStyle w:val="ListNumber"/>
+        <w:ind w:left="425" w:hanging="312"/>
       </w:pPr>
       <w:r>
-        <w:t>เลือก “รับเรื่อง” แล้วเลือกทีมที่รับผิดชอบ (ต้องนำเข้าข้อมูลทีมก่อน หัวข้อ 3)</w:t>
+        <w:t>2.  เลือก “รับเรื่อง” แล้วเลือกทีมที่รับผิดชอบ (ต้องนำเข้าข้อมูลทีมก่อน หัวข้อ 3)</w:t>
       </w:r>
     </w:p>
     <w:p>
       <w:pPr>
-        <w:pStyle w:val="ListNumber"/>
+        <w:ind w:left="425" w:hanging="312"/>
       </w:pPr>
       <w:r>
-        <w:t>เลือก “อัปเดตการทำงาน” เพื่อบันทึกความคืบหน้า ผู้รับผิดชอบ และทรัพยากรที่ใช้ วัสดุสิ้นเปลืองจะตัดสต็อกอัตโนมัติ (ใช้เกินที่มีไม่ได้)</w:t>
+        <w:t>3.  เลือก “อัปเดตการทำงาน” เพื่อบันทึกความคืบหน้า ผู้รับผิดชอบ และทรัพยากรที่ใช้ วัสดุสิ้นเปลืองจะตัดสต็อกอัตโนมัติ (ใช้เกินที่มีไม่ได้)</w:t>
       </w:r>
     </w:p>
     <w:p>
       <w:pPr>
-        <w:pStyle w:val="ListNumber"/>
+        <w:ind w:left="425" w:hanging="312"/>
       </w:pPr>
       <w:r>
-        <w:t>เปลี่ยนสถานะเป็น “เสร็จสิ้น” เมื่อจบงาน ทุกขั้นตอนบันทึกใน “ประวัติการดำเนินงาน”</w:t>
+        <w:t>4.  เปลี่ยนสถานะเป็น “เสร็จสิ้น” เมื่อจบงาน ทุกขั้นตอนบันทึกใน “ประวัติการดำเนินงาน”</w:t>
       </w:r>
     </w:p>
     <w:p>
@@ -5512,26 +4115,26 @@
     </w:p>
     <w:p>
       <w:pPr>
-        <w:pStyle w:val="ListNumber"/>
+        <w:ind w:left="425" w:hanging="312"/>
       </w:pPr>
       <w:r>
-        <w:t>ในเหตุการณ์ที่รับเรื่องแล้ว เลือก “แจ้งเหตุภัยพิบัติ” เรื่องจะย้ายไปเมนู “ภัยพิบัติ”</w:t>
+        <w:t>1.  ในเหตุการณ์ที่รับเรื่องแล้ว เลือก “แจ้งเหตุภัยพิบัติ” เรื่องจะย้ายไปเมนู “ภัยพิบัติ”</w:t>
       </w:r>
     </w:p>
     <w:p>
       <w:pPr>
-        <w:pStyle w:val="ListNumber"/>
+        <w:ind w:left="425" w:hanging="312"/>
       </w:pPr>
       <w:r>
-        <w:t>เลือก “ประเมินสถานการณ์” วาดพื้นที่ได้รับผลกระทบ แล้วเลือก “บันทึกผลประเมินเป็น Version ใหม่”</w:t>
+        <w:t>2.  เลือก “ประเมินสถานการณ์” วาดพื้นที่ได้รับผลกระทบ แล้วเลือก “บันทึกผลประเมินเป็น Version ใหม่”</w:t>
       </w:r>
     </w:p>
     <w:p>
       <w:pPr>
-        <w:pStyle w:val="ListNumber"/>
+        <w:ind w:left="425" w:hanging="312"/>
       </w:pPr>
       <w:r>
-        <w:t>ในแผนรับมือ เทียบทรัพยากร “ต้องใช้ / มีพร้อมใช้ / เพียงพอ หรือ ไม่เพียงพอ” แล้วเลือก “เลือกใช้ Version นี้” แก้รายการได้ด้วย “แก้ไขทรัพยากร”</w:t>
+        <w:t>3.  ในแผนรับมือ เทียบทรัพยากร “ต้องใช้ / มีพร้อมใช้ / เพียงพอ หรือ ไม่เพียงพอ” แล้วเลือก “เลือกใช้ Version นี้” แก้รายการได้ด้วย “แก้ไขทรัพยากร”</w:t>
       </w:r>
     </w:p>
     <w:p>
@@ -5552,42 +4155,42 @@
     </w:p>
     <w:p>
       <w:pPr>
-        <w:pStyle w:val="ListNumber"/>
+        <w:ind w:left="425" w:hanging="312"/>
       </w:pPr>
       <w:r>
-        <w:t>เมนู “กฎการประเมินทรัพยากร” ไปยัง “สร้างกฎใหม่”</w:t>
+        <w:t>1.  เมนู “กฎการประเมินทรัพยากร” ไปยัง “สร้างกฎใหม่”</w:t>
       </w:r>
     </w:p>
     <w:p>
       <w:pPr>
-        <w:pStyle w:val="ListNumber"/>
+        <w:ind w:left="425" w:hanging="312"/>
       </w:pPr>
       <w:r>
-        <w:t>ข้อมูลกฎ: ชื่อ ประเภทภัย ความรุนแรง (เฝ้าระวัง/เร่งด่วน/วิกฤต)</w:t>
+        <w:t>2.  ข้อมูลกฎ: ชื่อ ประเภทภัย ความรุนแรง (เฝ้าระวัง/เร่งด่วน/วิกฤต)</w:t>
       </w:r>
     </w:p>
     <w:p>
       <w:pPr>
-        <w:pStyle w:val="ListNumber"/>
+        <w:ind w:left="425" w:hanging="312"/>
       </w:pPr>
       <w:r>
-        <w:t>เงื่อนไข: เลือกตัวแปร (ระดับน้ำ ฝน ลม Hotspot ประชากร ครัวเรือน พื้นที่) ต้องมีประชากรหรือพื้นที่อย่างน้อย 1 ข้อ เงื่อนไขหลายข้อผ่านเมื่อข้อใดข้อหนึ่งเป็นจริง</w:t>
+        <w:t>3.  เงื่อนไข: เลือกตัวแปร (ระดับน้ำ ฝน ลม Hotspot ประชากร ครัวเรือน พื้นที่) ต้องมีประชากรหรือพื้นที่อย่างน้อย 1 ข้อ เงื่อนไขหลายข้อผ่านเมื่อข้อใดข้อหนึ่งเป็นจริง</w:t>
       </w:r>
     </w:p>
     <w:p>
       <w:pPr>
-        <w:pStyle w:val="ListNumber"/>
+        <w:ind w:left="425" w:hanging="312"/>
       </w:pPr>
       <w:r>
-        <w:t>สูตรคำนวณ: ทรัพยากร + จำนวน ต่อ N คน/ครัวเรือน/หมู่บ้าน/พื้นที่</w:t>
+        <w:t>4.  สูตรคำนวณ: ทรัพยากร + จำนวน ต่อ N คน/ครัวเรือน/หมู่บ้าน/พื้นที่</w:t>
       </w:r>
     </w:p>
     <w:p>
       <w:pPr>
-        <w:pStyle w:val="ListNumber"/>
+        <w:ind w:left="425" w:hanging="312"/>
       </w:pPr>
       <w:r>
-        <w:t>ตรวจสอบ แล้วบันทึก เปิด-ปิดกฎได้ด้วย “เปิดใช้”</w:t>
+        <w:t>5.  ตรวจสอบ แล้วบันทึก เปิด-ปิดกฎได้ด้วย “เปิดใช้”</w:t>
       </w:r>
     </w:p>
     <w:p>
@@ -5628,34 +4231,34 @@
     </w:p>
     <w:p>
       <w:pPr>
-        <w:pStyle w:val="ListNumber"/>
+        <w:ind w:left="425" w:hanging="312"/>
       </w:pPr>
       <w:r>
-        <w:t>เมนู “กิจกรรมในพื้นที่” ไปยัง เพิ่มกิจกรรม</w:t>
+        <w:t>1.  เมนู “กิจกรรมในพื้นที่” ไปยัง เพิ่มกิจกรรม</w:t>
       </w:r>
     </w:p>
     <w:p>
       <w:pPr>
-        <w:pStyle w:val="ListNumber"/>
+        <w:ind w:left="425" w:hanging="312"/>
       </w:pPr>
       <w:r>
-        <w:t>กรอกชื่อกิจกรรม ประเภท (งานประจำปี/เทศกาล, ศาสนา/ประเพณี, กีฬา/นันทนาการ, ตลาดนัด/ออกร้าน, ประชุม/อบรม, หน่วยบริการเคลื่อนที่, อื่น ๆ) วันเวลาเริ่ม/สิ้นสุด</w:t>
+        <w:t>2.  กรอกชื่อกิจกรรม ประเภท (งานประจำปี/เทศกาล, ศาสนา/ประเพณี, กีฬา/นันทนาการ, ตลาดนัด/ออกร้าน, ประชุม/อบรม, หน่วยบริการเคลื่อนที่, อื่น ๆ) วันเวลาเริ่ม/สิ้นสุด</w:t>
       </w:r>
     </w:p>
     <w:p>
       <w:pPr>
-        <w:pStyle w:val="ListNumber"/>
+        <w:ind w:left="425" w:hanging="312"/>
       </w:pPr>
       <w:r>
-        <w:t>กรอกผู้จัด จำนวนผู้ร่วมงานโดยประมาณ ผู้ประสานงาน หมายเลขโทรศัพท์ติดต่อ</w:t>
+        <w:t>3.  กรอกผู้จัด จำนวนผู้ร่วมงานโดยประมาณ ผู้ประสานงาน หมายเลขโทรศัพท์ติดต่อ</w:t>
       </w:r>
     </w:p>
     <w:p>
       <w:pPr>
-        <w:pStyle w:val="ListNumber"/>
+        <w:ind w:left="425" w:hanging="312"/>
       </w:pPr>
       <w:r>
-        <w:t>ระบุ “รูปหลัก (แสดงเป็นไอคอนบนแผนที่)” และปักสถานที่จัด (ต้องอยู่ในเขต อบต.)</w:t>
+        <w:t>4.  ระบุ “รูปหลัก (แสดงเป็นไอคอนบนแผนที่)” และปักสถานที่จัด (ต้องอยู่ในเขต อบต.)</w:t>
       </w:r>
     </w:p>
     <w:p>
@@ -5691,34 +4294,34 @@
     </w:p>
     <w:p>
       <w:pPr>
-        <w:pStyle w:val="ListNumber"/>
+        <w:ind w:left="425" w:hanging="312"/>
       </w:pPr>
       <w:r>
-        <w:t>เมนู “โครงการ” ไปยัง เพิ่มโครงการ</w:t>
+        <w:t>1.  เมนู “โครงการ” ไปยัง เพิ่มโครงการ</w:t>
       </w:r>
     </w:p>
     <w:p>
       <w:pPr>
-        <w:pStyle w:val="ListNumber"/>
+        <w:ind w:left="425" w:hanging="312"/>
       </w:pPr>
       <w:r>
-        <w:t>กรอกชื่อ รหัสโครงการ (e-plan/เลขสัญญา) กลุ่มโครงการ (10 กลุ่ม เช่น โครงสร้างพื้นฐาน แหล่งน้ำและการเกษตร สาธารณสุข) หน่วยงานรับผิดชอบ</w:t>
+        <w:t>2.  กรอกชื่อ รหัสโครงการ (e-plan/เลขสัญญา) กลุ่มโครงการ (10 กลุ่ม เช่น โครงสร้างพื้นฐาน แหล่งน้ำและการเกษตร สาธารณสุข) หน่วยงานรับผิดชอบ</w:t>
       </w:r>
     </w:p>
     <w:p>
       <w:pPr>
-        <w:pStyle w:val="ListNumber"/>
+        <w:ind w:left="425" w:hanging="312"/>
       </w:pPr>
       <w:r>
-        <w:t>กรอกปีงบประมาณ (พ.ศ. เริ่ม 1 ต.ค.) งบประมาณ (บาท) ผลการอนุมัติ แหล่งงบประมาณ สถานะ และความคืบหน้า (%)</w:t>
+        <w:t>3.  กรอกปีงบประมาณ (พ.ศ. เริ่ม 1 ต.ค.) งบประมาณ (บาท) ผลการอนุมัติ แหล่งงบประมาณ สถานะ และความคืบหน้า (%)</w:t>
       </w:r>
     </w:p>
     <w:p>
       <w:pPr>
-        <w:pStyle w:val="ListNumber"/>
+        <w:ind w:left="425" w:hanging="312"/>
       </w:pPr>
       <w:r>
-        <w:t>แนบรูปและปักสถานที่ได้ (ไม่บังคับ)</w:t>
+        <w:t>4.  แนบรูปและปักสถานที่ได้ (ไม่บังคับ)</w:t>
       </w:r>
     </w:p>
     <w:p>
@@ -5754,34 +4357,34 @@
     </w:p>
     <w:p>
       <w:pPr>
-        <w:pStyle w:val="ListNumber"/>
+        <w:ind w:left="425" w:hanging="312"/>
       </w:pPr>
       <w:r>
-        <w:t>เมนู “กล้องวงจรปิด” ไปยัง เพิ่มกล้อง</w:t>
+        <w:t>1.  เมนู “กล้องวงจรปิด” ไปยัง เพิ่มกล้อง</w:t>
       </w:r>
     </w:p>
     <w:p>
       <w:pPr>
-        <w:pStyle w:val="ListNumber"/>
+        <w:ind w:left="425" w:hanging="312"/>
       </w:pPr>
       <w:r>
-        <w:t>กรอกชื่อ รหัสกล้อง สถานะ (ใช้งาน/ซ่อมบำรุง/ปิดใช้งาน) ชื่อสถานที่</w:t>
+        <w:t>2.  กรอกชื่อ รหัสกล้อง สถานะ (ใช้งาน/ซ่อมบำรุง/ปิดใช้งาน) ชื่อสถานที่</w:t>
       </w:r>
     </w:p>
     <w:p>
       <w:pPr>
-        <w:pStyle w:val="ListNumber"/>
+        <w:ind w:left="425" w:hanging="312"/>
       </w:pPr>
       <w:r>
-        <w:t>วาง Stream URL ระบบตรวจประเภทให้ (HLS .m3u8 / MJPEG / MP4-WebM / Embed) เลือก “ทดสอบสตรีม”</w:t>
+        <w:t>3.  วาง Stream URL ระบบตรวจประเภทให้ (HLS .m3u8 / MJPEG / MP4-WebM / Embed) เลือก “ทดสอบสตรีม”</w:t>
       </w:r>
     </w:p>
     <w:p>
       <w:pPr>
-        <w:pStyle w:val="ListNumber"/>
+        <w:ind w:left="425" w:hanging="312"/>
       </w:pPr>
       <w:r>
-        <w:t>ปักตำแหน่งบนแผนที่ แล้วบันทึก ดูภาพสดได้ด้วย “ดูสด”</w:t>
+        <w:t>4.  ปักตำแหน่งบนแผนที่ แล้วบันทึก ดูภาพสดได้ด้วย “ดูสด”</w:t>
       </w:r>
     </w:p>
     <w:p>
@@ -6294,34 +4897,34 @@
     </w:p>
     <w:p>
       <w:pPr>
-        <w:pStyle w:val="ListNumber"/>
+        <w:ind w:left="425" w:hanging="312"/>
       </w:pPr>
       <w:r>
-        <w:t>เมนู “ผู้ช่วย AI” ไปยัง แท็บ “แชต” เลือกโมเดลจาก “เลือกโมเดล AI”</w:t>
+        <w:t>1.  เมนู “ผู้ช่วย AI” ไปยัง แท็บ “แชต” เลือกโมเดลจาก “เลือกโมเดล AI”</w:t>
       </w:r>
     </w:p>
     <w:p>
       <w:pPr>
-        <w:pStyle w:val="ListNumber"/>
+        <w:ind w:left="425" w:hanging="312"/>
       </w:pPr>
       <w:r>
-        <w:t>พิมพ์คำถาม หรือกดคำถามแนะนำ</w:t>
+        <w:t>2.  พิมพ์คำถาม หรือกดคำถามแนะนำ</w:t>
       </w:r>
     </w:p>
     <w:p>
       <w:pPr>
-        <w:pStyle w:val="ListNumber"/>
+        <w:ind w:left="425" w:hanging="312"/>
       </w:pPr>
       <w:r>
-        <w:t>รอคำตอบ (คำตอบแสดงครั้งเดียวเมื่อเสร็จ อาจใช้เวลาสักครู่)</w:t>
+        <w:t>3.  รอคำตอบ (คำตอบแสดงครั้งเดียวเมื่อเสร็จ อาจใช้เวลาสักครู่)</w:t>
       </w:r>
     </w:p>
     <w:p>
       <w:pPr>
-        <w:pStyle w:val="ListNumber"/>
+        <w:ind w:left="425" w:hanging="312"/>
       </w:pPr>
       <w:r>
-        <w:t>ในกราฟเลือก “สลับกราฟ/ตาราง” หรือ “ดาวน์โหลด CSV” คำตอบทั้งหมดเลือก “พิมพ์ / PDF” หรือ “คัดลอก” ได้</w:t>
+        <w:t>4.  ในกราฟเลือก “สลับกราฟ/ตาราง” หรือ “ดาวน์โหลด CSV” คำตอบทั้งหมดเลือก “พิมพ์ / PDF” หรือ “คัดลอก” ได้</w:t>
       </w:r>
     </w:p>
     <w:p>
@@ -6332,261 +4935,37 @@
         <w:t>ตัวอย่างคำถาม</w:t>
       </w:r>
     </w:p>
-    <w:tbl>
-      <w:tblPr>
-        <w:tblW w:type="auto" w:w="0"/>
-        <w:jc w:val="center"/>
-        <w:tblLook w:firstColumn="1" w:firstRow="1" w:lastColumn="0" w:lastRow="0" w:noHBand="0" w:noVBand="1" w:val="04A0"/>
-        <w:tblBorders>
-          <w:top w:val="single" w:sz="4" w:color="D9D9D9"/>
-          <w:left w:val="single" w:sz="4" w:color="D9D9D9"/>
-          <w:bottom w:val="single" w:sz="4" w:color="D9D9D9"/>
-          <w:right w:val="single" w:sz="4" w:color="D9D9D9"/>
-          <w:insideH w:val="single" w:sz="4" w:color="D9D9D9"/>
-          <w:insideV w:val="single" w:sz="4" w:color="D9D9D9"/>
-        </w:tblBorders>
-      </w:tblPr>
-      <w:tblGrid>
-        <w:gridCol w:w="4762"/>
-        <w:gridCol w:w="4762"/>
-      </w:tblGrid>
-      <w:tr>
-        <w:tc>
-          <w:tcPr>
-            <w:tcW w:type="dxa" w:w="4762"/>
-            <w:vAlign w:val="center"/>
-            <w:tcMar>
-              <w:top w:w="100" w:type="dxa"/>
-              <w:start w:w="120" w:type="dxa"/>
-              <w:bottom w:w="100" w:type="dxa"/>
-              <w:end w:w="120" w:type="dxa"/>
-            </w:tcMar>
-            <w:shd w:fill="1F4E78"/>
-          </w:tcPr>
-          <w:p>
-            <w:pPr>
-              <w:spacing w:after="0"/>
-              <w:jc w:val="center"/>
-            </w:pPr>
-            <w:r>
-              <w:rPr>
-                <w:rFonts w:ascii="TH Sarabun New" w:hAnsi="TH Sarabun New" w:eastAsia="TH Sarabun New"/>
-                <w:b/>
-                <w:color w:val="FFFFFF"/>
-                <w:sz w:val="28"/>
-              </w:rPr>
-              <w:t>•</w:t>
-            </w:r>
-          </w:p>
-        </w:tc>
-        <w:tc>
-          <w:tcPr>
-            <w:tcW w:type="dxa" w:w="4762"/>
-            <w:vAlign w:val="center"/>
-            <w:tcMar>
-              <w:top w:w="100" w:type="dxa"/>
-              <w:start w:w="120" w:type="dxa"/>
-              <w:bottom w:w="100" w:type="dxa"/>
-              <w:end w:w="120" w:type="dxa"/>
-            </w:tcMar>
-            <w:shd w:fill="1F4E78"/>
-          </w:tcPr>
-          <w:p>
-            <w:pPr>
-              <w:spacing w:after="0"/>
-              <w:jc w:val="left"/>
-            </w:pPr>
-            <w:r>
-              <w:rPr>
-                <w:rFonts w:ascii="TH Sarabun New" w:hAnsi="TH Sarabun New" w:eastAsia="TH Sarabun New"/>
-                <w:b/>
-                <w:color w:val="FFFFFF"/>
-                <w:sz w:val="28"/>
-              </w:rPr>
-              <w:t>สรุปเหตุการณ์ 3 เดือนล่าสุดแยกตามสถานะเป็นกราฟ</w:t>
-            </w:r>
-          </w:p>
-        </w:tc>
-      </w:tr>
-      <w:tr>
-        <w:tc>
-          <w:tcPr>
-            <w:tcW w:type="dxa" w:w="4762"/>
-            <w:vAlign w:val="center"/>
-            <w:tcMar>
-              <w:top w:w="100" w:type="dxa"/>
-              <w:start w:w="120" w:type="dxa"/>
-              <w:bottom w:w="100" w:type="dxa"/>
-              <w:end w:w="120" w:type="dxa"/>
-            </w:tcMar>
-            <w:shd w:fill="FFFFFF"/>
-          </w:tcPr>
-          <w:p>
-            <w:pPr>
-              <w:spacing w:after="0"/>
-              <w:jc w:val="center"/>
-            </w:pPr>
-            <w:r>
-              <w:rPr>
-                <w:rFonts w:ascii="TH Sarabun New" w:hAnsi="TH Sarabun New" w:eastAsia="TH Sarabun New"/>
-                <w:b w:val="0"/>
-                <w:color w:val="000000"/>
-                <w:sz w:val="28"/>
-              </w:rPr>
-              <w:t>•</w:t>
-            </w:r>
-          </w:p>
-        </w:tc>
-        <w:tc>
-          <w:tcPr>
-            <w:tcW w:type="dxa" w:w="4762"/>
-            <w:vAlign w:val="center"/>
-            <w:tcMar>
-              <w:top w:w="100" w:type="dxa"/>
-              <w:start w:w="120" w:type="dxa"/>
-              <w:bottom w:w="100" w:type="dxa"/>
-              <w:end w:w="120" w:type="dxa"/>
-            </w:tcMar>
-            <w:shd w:fill="FFFFFF"/>
-          </w:tcPr>
-          <w:p>
-            <w:pPr>
-              <w:spacing w:after="0"/>
-              <w:jc w:val="left"/>
-            </w:pPr>
-            <w:r>
-              <w:rPr>
-                <w:rFonts w:ascii="TH Sarabun New" w:hAnsi="TH Sarabun New" w:eastAsia="TH Sarabun New"/>
-                <w:b w:val="0"/>
-                <w:color w:val="000000"/>
-                <w:sz w:val="28"/>
-              </w:rPr>
-              <w:t>งบประมาณโครงการต่อปีงบประมาณ แยกตามกลุ่ม</w:t>
-            </w:r>
-          </w:p>
-        </w:tc>
-      </w:tr>
-      <w:tr>
-        <w:tc>
-          <w:tcPr>
-            <w:tcW w:type="dxa" w:w="4762"/>
-            <w:vAlign w:val="center"/>
-            <w:tcMar>
-              <w:top w:w="100" w:type="dxa"/>
-              <w:start w:w="120" w:type="dxa"/>
-              <w:bottom w:w="100" w:type="dxa"/>
-              <w:end w:w="120" w:type="dxa"/>
-            </w:tcMar>
-            <w:shd w:fill="EDF3F8"/>
-          </w:tcPr>
-          <w:p>
-            <w:pPr>
-              <w:spacing w:after="0"/>
-              <w:jc w:val="center"/>
-            </w:pPr>
-            <w:r>
-              <w:rPr>
-                <w:rFonts w:ascii="TH Sarabun New" w:hAnsi="TH Sarabun New" w:eastAsia="TH Sarabun New"/>
-                <w:b w:val="0"/>
-                <w:color w:val="000000"/>
-                <w:sz w:val="28"/>
-              </w:rPr>
-              <w:t>•</w:t>
-            </w:r>
-          </w:p>
-        </w:tc>
-        <w:tc>
-          <w:tcPr>
-            <w:tcW w:type="dxa" w:w="4762"/>
-            <w:vAlign w:val="center"/>
-            <w:tcMar>
-              <w:top w:w="100" w:type="dxa"/>
-              <w:start w:w="120" w:type="dxa"/>
-              <w:bottom w:w="100" w:type="dxa"/>
-              <w:end w:w="120" w:type="dxa"/>
-            </w:tcMar>
-            <w:shd w:fill="EDF3F8"/>
-          </w:tcPr>
-          <w:p>
-            <w:pPr>
-              <w:spacing w:after="0"/>
-              <w:jc w:val="left"/>
-            </w:pPr>
-            <w:r>
-              <w:rPr>
-                <w:rFonts w:ascii="TH Sarabun New" w:hAnsi="TH Sarabun New" w:eastAsia="TH Sarabun New"/>
-                <w:b w:val="0"/>
-                <w:color w:val="000000"/>
-                <w:sz w:val="28"/>
-              </w:rPr>
-              <w:t>รายงานค่า PM2.5 และระดับน้ำล่าสุด</w:t>
-            </w:r>
-          </w:p>
-        </w:tc>
-      </w:tr>
-      <w:tr>
-        <w:tc>
-          <w:tcPr>
-            <w:tcW w:type="dxa" w:w="4762"/>
-            <w:vAlign w:val="center"/>
-            <w:tcMar>
-              <w:top w:w="100" w:type="dxa"/>
-              <w:start w:w="120" w:type="dxa"/>
-              <w:bottom w:w="100" w:type="dxa"/>
-              <w:end w:w="120" w:type="dxa"/>
-            </w:tcMar>
-            <w:shd w:fill="FFFFFF"/>
-          </w:tcPr>
-          <w:p>
-            <w:pPr>
-              <w:spacing w:after="0"/>
-              <w:jc w:val="center"/>
-            </w:pPr>
-            <w:r>
-              <w:rPr>
-                <w:rFonts w:ascii="TH Sarabun New" w:hAnsi="TH Sarabun New" w:eastAsia="TH Sarabun New"/>
-                <w:b w:val="0"/>
-                <w:color w:val="000000"/>
-                <w:sz w:val="28"/>
-              </w:rPr>
-              <w:t>•</w:t>
-            </w:r>
-          </w:p>
-        </w:tc>
-        <w:tc>
-          <w:tcPr>
-            <w:tcW w:type="dxa" w:w="4762"/>
-            <w:vAlign w:val="center"/>
-            <w:tcMar>
-              <w:top w:w="100" w:type="dxa"/>
-              <w:start w:w="120" w:type="dxa"/>
-              <w:bottom w:w="100" w:type="dxa"/>
-              <w:end w:w="120" w:type="dxa"/>
-            </w:tcMar>
-            <w:shd w:fill="FFFFFF"/>
-          </w:tcPr>
-          <w:p>
-            <w:pPr>
-              <w:spacing w:after="0"/>
-              <w:jc w:val="left"/>
-            </w:pPr>
-            <w:r>
-              <w:rPr>
-                <w:rFonts w:ascii="TH Sarabun New" w:hAnsi="TH Sarabun New" w:eastAsia="TH Sarabun New"/>
-                <w:b w:val="0"/>
-                <w:color w:val="000000"/>
-                <w:sz w:val="28"/>
-              </w:rPr>
-              <w:t>ประชากรแต่ละหมู่บ้านเทียบกัน</w:t>
-            </w:r>
-          </w:p>
-        </w:tc>
-      </w:tr>
-    </w:tbl>
     <w:p>
       <w:pPr>
-        <w:spacing w:after="0"/>
-      </w:pPr>
+        <w:ind w:left="425" w:hanging="255"/>
+      </w:pPr>
+      <w:r>
+        <w:t>•  สรุปเหตุการณ์ 3 เดือนล่าสุดแยกตามสถานะเป็นกราฟ</w:t>
+      </w:r>
+    </w:p>
+    <w:p>
+      <w:pPr>
+        <w:ind w:left="425" w:hanging="255"/>
+      </w:pPr>
+      <w:r>
+        <w:t>•  งบประมาณโครงการต่อปีงบประมาณ แยกตามกลุ่ม</w:t>
+      </w:r>
+    </w:p>
+    <w:p>
+      <w:pPr>
+        <w:ind w:left="425" w:hanging="255"/>
+      </w:pPr>
+      <w:r>
+        <w:t>•  รายงานค่า PM2.5 และระดับน้ำล่าสุด</w:t>
+      </w:r>
+    </w:p>
+    <w:p>
+      <w:pPr>
+        <w:ind w:left="425" w:hanging="255"/>
+      </w:pPr>
+      <w:r>
+        <w:t>•  ประชากรแต่ละหมู่บ้านเทียบกัน</w:t>
+      </w:r>
     </w:p>
     <w:p>
       <w:pPr>
@@ -6598,34 +4977,34 @@
     </w:p>
     <w:p>
       <w:pPr>
-        <w:pStyle w:val="ListNumber"/>
+        <w:ind w:left="425" w:hanging="312"/>
       </w:pPr>
       <w:r>
-        <w:t>เลือก “เก็บผลลัพธ์” (ทั้งคำตอบ) หรือ “เก็บกราฟนี้ไว้รันใหม่” (เฉพาะกราฟ)</w:t>
+        <w:t>1.  เลือก “เก็บผลลัพธ์” (ทั้งคำตอบ) หรือ “เก็บกราฟนี้ไว้รันใหม่” (เฉพาะกราฟ)</w:t>
       </w:r>
     </w:p>
     <w:p>
       <w:pPr>
-        <w:pStyle w:val="ListNumber"/>
+        <w:ind w:left="425" w:hanging="312"/>
       </w:pPr>
       <w:r>
-        <w:t>เปิดแท็บ “ที่เก็บไว้” กำหนดช่วง ตั้งแต่/ถึง แล้วรันใหม่เพื่อได้ข้อมูลล่าสุด - เหมาะกับรายงานประจำเดือน</w:t>
+        <w:t>2.  เปิดแท็บ “ที่เก็บไว้” กำหนดช่วง ตั้งแต่/ถึง แล้วรันใหม่เพื่อได้ข้อมูลล่าสุด - เหมาะกับรายงานประจำเดือน</w:t>
       </w:r>
     </w:p>
     <w:p>
       <w:pPr>
-        <w:pStyle w:val="ListNumber"/>
+        <w:ind w:left="425" w:hanging="312"/>
       </w:pPr>
       <w:r>
-        <w:t>เลือก “ให้ AI สรุปใหม่” เพื่อเขียนบทสรุปจากข้อมูลใหม่</w:t>
+        <w:t>3.  เลือก “ให้ AI สรุปใหม่” เพื่อเขียนบทสรุปจากข้อมูลใหม่</w:t>
       </w:r>
     </w:p>
     <w:p>
       <w:pPr>
-        <w:pStyle w:val="ListNumber"/>
+        <w:ind w:left="425" w:hanging="312"/>
       </w:pPr>
       <w:r>
-        <w:t>เลือก “แชร์ใน อบต.” ให้เพื่อนร่วมงานใช้รายงานเดียวกัน</w:t>
+        <w:t>4.  เลือก “แชร์ใน อบต.” ให้เพื่อนร่วมงานใช้รายงานเดียวกัน</w:t>
       </w:r>
     </w:p>
     <w:p>
@@ -6634,6 +5013,161 @@
       </w:pPr>
       <w:r>
         <w:t>AI เห็นเฉพาะข้อมูลที่บัญชีของคุณเห็น และไม่เห็นชื่อ/หมายเลขโทรศัพท์ของผู้แจ้งเหตุ ตรวจทานตัวเลขสำคัญก่อนนำไปใช้ในเอกสารราชการ</w:t>
+      </w:r>
+    </w:p>
+    <w:p>
+      <w:r>
+        <w:br w:type="page"/>
+      </w:r>
+    </w:p>
+    <w:p>
+      <w:pPr>
+        <w:pStyle w:val="Heading1"/>
+      </w:pPr>
+      <w:r>
+        <w:t>7 ข่าวประชาสัมพันธ์ เสียงตามสาย และช่องทางแจ้งเตือน</w:t>
+      </w:r>
+    </w:p>
+    <w:p>
+      <w:pPr>
+        <w:ind w:firstLine="425"/>
+      </w:pPr>
+      <w:r>
+        <w:t>AI สรุปข่าวจากข้อมูลจริงในระบบ เจ้าหน้าที่ตรวจแก้ สร้างเสียงอ่าน แล้วเผยแพร่ไปเสียงตามสาย Facebook Instagram และกลุ่มแชตได้ในที่เดียว</w:t>
+      </w:r>
+    </w:p>
+    <w:p>
+      <w:pPr>
+        <w:keepNext/>
+      </w:pPr>
+      <w:r>
+        <w:rPr>
+          <w:rFonts w:ascii="TH Sarabun New" w:hAnsi="TH Sarabun New" w:eastAsia="TH Sarabun New"/>
+          <w:b w:val="0"/>
+          <w:i/>
+          <w:color w:val="666666"/>
+          <w:sz w:val="28"/>
+        </w:rPr>
+        <w:t>หน้าข่าวประชาสัมพันธ์: รายการข่าว ปุ่มสร้างข่าวตอนนี้ และตารางข่าวล่าสุดพร้อมสถานะ</w:t>
+      </w:r>
+    </w:p>
+    <w:p>
+      <w:pPr>
+        <w:pStyle w:val="Heading3"/>
+      </w:pPr>
+      <w:r>
+        <w:t>การตั้งค่ารายการข่าว</w:t>
+      </w:r>
+    </w:p>
+    <w:p>
+      <w:pPr>
+        <w:ind w:left="425" w:hanging="312"/>
+      </w:pPr>
+      <w:r>
+        <w:t>1.  เมนู “ข่าวประชาสัมพันธ์” ไปยัง “เพิ่มรายการข่าว”</w:t>
+      </w:r>
+    </w:p>
+    <w:p>
+      <w:pPr>
+        <w:ind w:left="425" w:hanging="312"/>
+      </w:pPr>
+      <w:r>
+        <w:t>2.  ตั้งชื่อ แก้ prompt (คำสั่งให้ AI เขียนข่าว) และเลือกแหล่งข้อมูล: สภาพอากาศ ฝุ่น PM2.5 ระดับน้ำ จุดความร้อน กิจกรรม เหตุการณ์ (ไม่เปิดเผยผู้แจ้ง) ภัยพิบัติ โครงการ</w:t>
+      </w:r>
+    </w:p>
+    <w:p>
+      <w:pPr>
+        <w:ind w:left="425" w:hanging="312"/>
+      </w:pPr>
+      <w:r>
+        <w:t>3.  กำหนดวันและเวลาสร้างข่าวอัตโนมัติ หรือเลือก “สร้างเมื่อกดเท่านั้น”</w:t>
+      </w:r>
+    </w:p>
+    <w:p>
+      <w:pPr>
+        <w:ind w:left="425" w:hanging="312"/>
+      </w:pPr>
+      <w:r>
+        <w:t>4.  เลือกโมเดล AI เสียงอ่าน (TTS) ความยาวสูงสุด (50–1,000 คำ) และช่องทางเผยแพร่</w:t>
+      </w:r>
+    </w:p>
+    <w:p>
+      <w:pPr>
+        <w:ind w:left="425" w:hanging="312"/>
+      </w:pPr>
+      <w:r>
+        <w:t>5.  เลือกว่าจะ “เผยแพร่อัตโนมัติ” หรือให้เป็น “ร่าง รอตรวจ” ก่อนทุกครั้ง (แนะนำให้รอตรวจ)</w:t>
+      </w:r>
+    </w:p>
+    <w:p>
+      <w:pPr>
+        <w:pStyle w:val="Heading3"/>
+      </w:pPr>
+      <w:r>
+        <w:t>การตรวจสอบและเผยแพร่ข่าว</w:t>
+      </w:r>
+    </w:p>
+    <w:p>
+      <w:pPr>
+        <w:keepNext/>
+      </w:pPr>
+      <w:r>
+        <w:rPr>
+          <w:rFonts w:ascii="TH Sarabun New" w:hAnsi="TH Sarabun New" w:eastAsia="TH Sarabun New"/>
+          <w:b w:val="0"/>
+          <w:i/>
+          <w:color w:val="666666"/>
+          <w:sz w:val="28"/>
+        </w:rPr>
+        <w:t>หน้าตรวจข่าว: เนื้อหาข่าว บทอ่านออกเสียง เสียงอ่านข่าว MP3 ภาพข่าว และประวัติการส่ง</w:t>
+      </w:r>
+    </w:p>
+    <w:p>
+      <w:pPr>
+        <w:ind w:left="425" w:hanging="312"/>
+      </w:pPr>
+      <w:r>
+        <w:t>1.  เลือก “สร้างข่าวตอนนี้” หรือรอให้ถึงเวลาที่ตั้งไว้ แล้วเปิดข่าวจากตาราง “ข่าวล่าสุด”</w:t>
+      </w:r>
+    </w:p>
+    <w:p>
+      <w:pPr>
+        <w:ind w:left="425" w:hanging="312"/>
+      </w:pPr>
+      <w:r>
+        <w:t>2.  ตรวจ “หัวข้อข่าว” “ประเด็นสำคัญ” (บรรทัดละ 1 ข้อ ใช้ในโพสต์ Facebook/LINE) และ “บทอ่านออกเสียง” เทียบกับ “ข้อมูลที่ใช้สรุป (ตรวจข้อเท็จจริง)” ด้านล่าง</w:t>
+      </w:r>
+    </w:p>
+    <w:p>
+      <w:pPr>
+        <w:ind w:left="425" w:hanging="312"/>
+      </w:pPr>
+      <w:r>
+        <w:t>3.  แก้ข้อความแล้วเลือก “บันทึกข้อความ” - บันทึกก่อนสร้างเสียงหรือเผยแพร่ทุกครั้ง</w:t>
+      </w:r>
+    </w:p>
+    <w:p>
+      <w:pPr>
+        <w:ind w:left="425" w:hanging="312"/>
+      </w:pPr>
+      <w:r>
+        <w:t>4.  เลือก “สร้างเสียงใหม่” แล้วฟังในกล่อง “เสียงอ่านข่าว” (ดาวน์โหลด MP3 ได้) และเลือก “สร้างภาพข่าว” หากจะลง Instagram (บังคับมีภาพ)</w:t>
+      </w:r>
+    </w:p>
+    <w:p>
+      <w:pPr>
+        <w:ind w:left="425" w:hanging="312"/>
+      </w:pPr>
+      <w:r>
+        <w:t>5.  เลือกช่อง “ช่องทางเผยแพร่” แล้วเลือก “เผยแพร่” ผลการส่งแต่ละช่องทางแสดงใน “ประวัติการส่ง”</w:t>
+      </w:r>
+    </w:p>
+    <w:p>
+      <w:pPr>
+        <w:ind w:firstLine="425"/>
+      </w:pPr>
+      <w:r>
+        <w:t>หากสถานะเป็น “สร้างไม่สำเร็จ” หรือขึ้นข้อผิดพลาด TTS ให้ผู้ดูแลระบบตรวจการตั้งค่าผู้ให้บริการ AI หรือเสียง (เช่น Base URL ต้องลงท้ายด้วย /v1)</w:t>
       </w:r>
     </w:p>
     <w:p>
@@ -7150,161 +5684,6 @@
         <w:pStyle w:val="Heading1"/>
       </w:pPr>
       <w:r>
-        <w:t>7 ข่าวประชาสัมพันธ์ เสียงตามสาย และช่องทางแจ้งเตือน</w:t>
-      </w:r>
-    </w:p>
-    <w:p>
-      <w:pPr>
-        <w:ind w:firstLine="425"/>
-      </w:pPr>
-      <w:r>
-        <w:t>AI สรุปข่าวจากข้อมูลจริงในระบบ เจ้าหน้าที่ตรวจแก้ สร้างเสียงอ่าน แล้วเผยแพร่ไปเสียงตามสาย Facebook Instagram และกลุ่มแชตได้ในที่เดียว</w:t>
-      </w:r>
-    </w:p>
-    <w:p>
-      <w:pPr>
-        <w:keepNext/>
-      </w:pPr>
-      <w:r>
-        <w:rPr>
-          <w:rFonts w:ascii="TH Sarabun New" w:hAnsi="TH Sarabun New" w:eastAsia="TH Sarabun New"/>
-          <w:b w:val="0"/>
-          <w:i/>
-          <w:color w:val="666666"/>
-          <w:sz w:val="28"/>
-        </w:rPr>
-        <w:t>หน้าข่าวประชาสัมพันธ์: รายการข่าว ปุ่มสร้างข่าวตอนนี้ และตารางข่าวล่าสุดพร้อมสถานะ</w:t>
-      </w:r>
-    </w:p>
-    <w:p>
-      <w:pPr>
-        <w:pStyle w:val="Heading3"/>
-      </w:pPr>
-      <w:r>
-        <w:t>การตั้งค่ารายการข่าว</w:t>
-      </w:r>
-    </w:p>
-    <w:p>
-      <w:pPr>
-        <w:pStyle w:val="ListNumber"/>
-      </w:pPr>
-      <w:r>
-        <w:t>เมนู “ข่าวประชาสัมพันธ์” ไปยัง “เพิ่มรายการข่าว”</w:t>
-      </w:r>
-    </w:p>
-    <w:p>
-      <w:pPr>
-        <w:pStyle w:val="ListNumber"/>
-      </w:pPr>
-      <w:r>
-        <w:t>ตั้งชื่อ แก้ prompt (คำสั่งให้ AI เขียนข่าว) และเลือกแหล่งข้อมูล: สภาพอากาศ ฝุ่น PM2.5 ระดับน้ำ จุดความร้อน กิจกรรม เหตุการณ์ (ไม่เปิดเผยผู้แจ้ง) ภัยพิบัติ โครงการ</w:t>
-      </w:r>
-    </w:p>
-    <w:p>
-      <w:pPr>
-        <w:pStyle w:val="ListNumber"/>
-      </w:pPr>
-      <w:r>
-        <w:t>กำหนดวันและเวลาสร้างข่าวอัตโนมัติ หรือเลือก “สร้างเมื่อกดเท่านั้น”</w:t>
-      </w:r>
-    </w:p>
-    <w:p>
-      <w:pPr>
-        <w:pStyle w:val="ListNumber"/>
-      </w:pPr>
-      <w:r>
-        <w:t>เลือกโมเดล AI เสียงอ่าน (TTS) ความยาวสูงสุด (50–1,000 คำ) และช่องทางเผยแพร่</w:t>
-      </w:r>
-    </w:p>
-    <w:p>
-      <w:pPr>
-        <w:pStyle w:val="ListNumber"/>
-      </w:pPr>
-      <w:r>
-        <w:t>เลือกว่าจะ “เผยแพร่อัตโนมัติ” หรือให้เป็น “ร่าง รอตรวจ” ก่อนทุกครั้ง (แนะนำให้รอตรวจ)</w:t>
-      </w:r>
-    </w:p>
-    <w:p>
-      <w:pPr>
-        <w:pStyle w:val="Heading3"/>
-      </w:pPr>
-      <w:r>
-        <w:t>การตรวจสอบและเผยแพร่ข่าว</w:t>
-      </w:r>
-    </w:p>
-    <w:p>
-      <w:pPr>
-        <w:keepNext/>
-      </w:pPr>
-      <w:r>
-        <w:rPr>
-          <w:rFonts w:ascii="TH Sarabun New" w:hAnsi="TH Sarabun New" w:eastAsia="TH Sarabun New"/>
-          <w:b w:val="0"/>
-          <w:i/>
-          <w:color w:val="666666"/>
-          <w:sz w:val="28"/>
-        </w:rPr>
-        <w:t>หน้าตรวจข่าว: เนื้อหาข่าว บทอ่านออกเสียง เสียงอ่านข่าว MP3 ภาพข่าว และประวัติการส่ง</w:t>
-      </w:r>
-    </w:p>
-    <w:p>
-      <w:pPr>
-        <w:pStyle w:val="ListNumber"/>
-      </w:pPr>
-      <w:r>
-        <w:t>เลือก “สร้างข่าวตอนนี้” หรือรอให้ถึงเวลาที่ตั้งไว้ แล้วเปิดข่าวจากตาราง “ข่าวล่าสุด”</w:t>
-      </w:r>
-    </w:p>
-    <w:p>
-      <w:pPr>
-        <w:pStyle w:val="ListNumber"/>
-      </w:pPr>
-      <w:r>
-        <w:t>ตรวจ “หัวข้อข่าว” “ประเด็นสำคัญ” (บรรทัดละ 1 ข้อ ใช้ในโพสต์ Facebook/LINE) และ “บทอ่านออกเสียง” เทียบกับ “ข้อมูลที่ใช้สรุป (ตรวจข้อเท็จจริง)” ด้านล่าง</w:t>
-      </w:r>
-    </w:p>
-    <w:p>
-      <w:pPr>
-        <w:pStyle w:val="ListNumber"/>
-      </w:pPr>
-      <w:r>
-        <w:t>แก้ข้อความแล้วเลือก “บันทึกข้อความ” - บันทึกก่อนสร้างเสียงหรือเผยแพร่ทุกครั้ง</w:t>
-      </w:r>
-    </w:p>
-    <w:p>
-      <w:pPr>
-        <w:pStyle w:val="ListNumber"/>
-      </w:pPr>
-      <w:r>
-        <w:t>เลือก “สร้างเสียงใหม่” แล้วฟังในกล่อง “เสียงอ่านข่าว” (ดาวน์โหลด MP3 ได้) และเลือก “สร้างภาพข่าว” หากจะลง Instagram (บังคับมีภาพ)</w:t>
-      </w:r>
-    </w:p>
-    <w:p>
-      <w:pPr>
-        <w:pStyle w:val="ListNumber"/>
-      </w:pPr>
-      <w:r>
-        <w:t>เลือกช่อง “ช่องทางเผยแพร่” แล้วเลือก “เผยแพร่” ผลการส่งแต่ละช่องทางแสดงใน “ประวัติการส่ง”</w:t>
-      </w:r>
-    </w:p>
-    <w:p>
-      <w:pPr>
-        <w:ind w:firstLine="425"/>
-      </w:pPr>
-      <w:r>
-        <w:t>หากสถานะเป็น “สร้างไม่สำเร็จ” หรือขึ้นข้อผิดพลาด TTS ให้ผู้ดูแลระบบตรวจการตั้งค่าผู้ให้บริการ AI หรือเสียง (เช่น Base URL ต้องลงท้ายด้วย /v1)</w:t>
-      </w:r>
-    </w:p>
-    <w:p>
-      <w:r>
-        <w:br w:type="page"/>
-      </w:r>
-    </w:p>
-    <w:p>
-      <w:pPr>
-        <w:pStyle w:val="Heading1"/>
-      </w:pPr>
-      <w:r>
         <w:t>8 งานสำหรับผู้ดูแลระบบ</w:t>
       </w:r>
     </w:p>
@@ -7318,34 +5697,34 @@
     </w:p>
     <w:p>
       <w:pPr>
-        <w:pStyle w:val="ListNumber"/>
+        <w:ind w:left="425" w:hanging="312"/>
       </w:pPr>
       <w:r>
-        <w:t>เมนู “จัดการผู้ใช้” ไปยัง เพิ่มผู้ใช้</w:t>
+        <w:t>1.  เมนู “จัดการผู้ใช้” ไปยัง เพิ่มผู้ใช้</w:t>
       </w:r>
     </w:p>
     <w:p>
       <w:pPr>
-        <w:pStyle w:val="ListNumber"/>
+        <w:ind w:left="425" w:hanging="312"/>
       </w:pPr>
       <w:r>
-        <w:t>กรอก “ชื่อผู้ใช้งาน” (ตัวพิมพ์เล็ก a-z ตัวเลข จุด _ -) รหัสผ่านและยืนยันรหัสผ่าน</w:t>
+        <w:t>2.  กรอก “ชื่อผู้ใช้งาน” (ตัวพิมพ์เล็ก a-z ตัวเลข จุด _ -) รหัสผ่านและยืนยันรหัสผ่าน</w:t>
       </w:r>
     </w:p>
     <w:p>
       <w:pPr>
-        <w:pStyle w:val="ListNumber"/>
+        <w:ind w:left="425" w:hanging="312"/>
       </w:pPr>
       <w:r>
-        <w:t>เลือก “สิทธิ์ผู้ใช้งาน”</w:t>
+        <w:t>3.  เลือก “สิทธิ์ผู้ใช้งาน”</w:t>
       </w:r>
     </w:p>
     <w:p>
       <w:pPr>
-        <w:pStyle w:val="ListNumber"/>
+        <w:ind w:left="425" w:hanging="312"/>
       </w:pPr>
       <w:r>
-        <w:t>ผู้ดูแลระบบกำหนดพื้นที่: ชื่อขอบเขตพื้นที่ดูแล ประเภทองค์กร (อบต./เทศบาล) แล้ว “เลือกพื้นที่เอง” (ค้นหาตำบลได้หลายตำบล) หรือ “เพิ่มไฟล์ขอบเขต” (KMZ/KML/GeoJSON/Shapefile ZIP)</w:t>
+        <w:t>4.  ผู้ดูแลระบบกำหนดพื้นที่: ชื่อขอบเขตพื้นที่ดูแล ประเภทองค์กร (อบต./เทศบาล) แล้ว “เลือกพื้นที่เอง” (ค้นหาตำบลได้หลายตำบล) หรือ “เพิ่มไฟล์ขอบเขต” (KMZ/KML/GeoJSON/Shapefile ZIP)</w:t>
       </w:r>
     </w:p>
     <w:p>
@@ -7701,203 +6080,29 @@
         <w:t>การตั้งค่าระบบส่วนกลาง</w:t>
       </w:r>
     </w:p>
-    <w:tbl>
-      <w:tblPr>
-        <w:tblW w:type="auto" w:w="0"/>
-        <w:jc w:val="center"/>
-        <w:tblLook w:firstColumn="1" w:firstRow="1" w:lastColumn="0" w:lastRow="0" w:noHBand="0" w:noVBand="1" w:val="04A0"/>
-        <w:tblBorders>
-          <w:top w:val="single" w:sz="4" w:color="D9D9D9"/>
-          <w:left w:val="single" w:sz="4" w:color="D9D9D9"/>
-          <w:bottom w:val="single" w:sz="4" w:color="D9D9D9"/>
-          <w:right w:val="single" w:sz="4" w:color="D9D9D9"/>
-          <w:insideH w:val="single" w:sz="4" w:color="D9D9D9"/>
-          <w:insideV w:val="single" w:sz="4" w:color="D9D9D9"/>
-        </w:tblBorders>
-      </w:tblPr>
-      <w:tblGrid>
-        <w:gridCol w:w="4762"/>
-        <w:gridCol w:w="4762"/>
-      </w:tblGrid>
-      <w:tr>
-        <w:tc>
-          <w:tcPr>
-            <w:tcW w:type="dxa" w:w="4762"/>
-            <w:vAlign w:val="center"/>
-            <w:tcMar>
-              <w:top w:w="100" w:type="dxa"/>
-              <w:start w:w="120" w:type="dxa"/>
-              <w:bottom w:w="100" w:type="dxa"/>
-              <w:end w:w="120" w:type="dxa"/>
-            </w:tcMar>
-            <w:shd w:fill="1F4E78"/>
-          </w:tcPr>
-          <w:p>
-            <w:pPr>
-              <w:spacing w:after="0"/>
-              <w:jc w:val="center"/>
-            </w:pPr>
-            <w:r>
-              <w:rPr>
-                <w:rFonts w:ascii="TH Sarabun New" w:hAnsi="TH Sarabun New" w:eastAsia="TH Sarabun New"/>
-                <w:b/>
-                <w:color w:val="FFFFFF"/>
-                <w:sz w:val="28"/>
-              </w:rPr>
-              <w:t>•</w:t>
-            </w:r>
-          </w:p>
-        </w:tc>
-        <w:tc>
-          <w:tcPr>
-            <w:tcW w:type="dxa" w:w="4762"/>
-            <w:vAlign w:val="center"/>
-            <w:tcMar>
-              <w:top w:w="100" w:type="dxa"/>
-              <w:start w:w="120" w:type="dxa"/>
-              <w:bottom w:w="100" w:type="dxa"/>
-              <w:end w:w="120" w:type="dxa"/>
-            </w:tcMar>
-            <w:shd w:fill="1F4E78"/>
-          </w:tcPr>
-          <w:p>
-            <w:pPr>
-              <w:spacing w:after="0"/>
-              <w:jc w:val="left"/>
-            </w:pPr>
-            <w:r>
-              <w:rPr>
-                <w:rFonts w:ascii="TH Sarabun New" w:hAnsi="TH Sarabun New" w:eastAsia="TH Sarabun New"/>
-                <w:b/>
-                <w:color w:val="FFFFFF"/>
-                <w:sz w:val="28"/>
-              </w:rPr>
-              <w:t>ตั้งค่าทั้งระบบ: ชื่อระบบ ชื่อย่อ โลโก้ ข้อความหน้าเข้าสู่ระบบ คีย์ Longdo/MapTiler URL Geocoder และค่าเริ่มต้นแผนที่</w:t>
-            </w:r>
-          </w:p>
-        </w:tc>
-      </w:tr>
-      <w:tr>
-        <w:tc>
-          <w:tcPr>
-            <w:tcW w:type="dxa" w:w="4762"/>
-            <w:vAlign w:val="center"/>
-            <w:tcMar>
-              <w:top w:w="100" w:type="dxa"/>
-              <w:start w:w="120" w:type="dxa"/>
-              <w:bottom w:w="100" w:type="dxa"/>
-              <w:end w:w="120" w:type="dxa"/>
-            </w:tcMar>
-            <w:shd w:fill="FFFFFF"/>
-          </w:tcPr>
-          <w:p>
-            <w:pPr>
-              <w:spacing w:after="0"/>
-              <w:jc w:val="center"/>
-            </w:pPr>
-            <w:r>
-              <w:rPr>
-                <w:rFonts w:ascii="TH Sarabun New" w:hAnsi="TH Sarabun New" w:eastAsia="TH Sarabun New"/>
-                <w:b w:val="0"/>
-                <w:color w:val="000000"/>
-                <w:sz w:val="28"/>
-              </w:rPr>
-              <w:t>•</w:t>
-            </w:r>
-          </w:p>
-        </w:tc>
-        <w:tc>
-          <w:tcPr>
-            <w:tcW w:type="dxa" w:w="4762"/>
-            <w:vAlign w:val="center"/>
-            <w:tcMar>
-              <w:top w:w="100" w:type="dxa"/>
-              <w:start w:w="120" w:type="dxa"/>
-              <w:bottom w:w="100" w:type="dxa"/>
-              <w:end w:w="120" w:type="dxa"/>
-            </w:tcMar>
-            <w:shd w:fill="FFFFFF"/>
-          </w:tcPr>
-          <w:p>
-            <w:pPr>
-              <w:spacing w:after="0"/>
-              <w:jc w:val="left"/>
-            </w:pPr>
-            <w:r>
-              <w:rPr>
-                <w:rFonts w:ascii="TH Sarabun New" w:hAnsi="TH Sarabun New" w:eastAsia="TH Sarabun New"/>
-                <w:b w:val="0"/>
-                <w:color w:val="000000"/>
-                <w:sz w:val="28"/>
-              </w:rPr>
-              <w:t>สถานะระบบ: ตรวจฐานข้อมูล MinIO MQTT Longdo Geocoder และงานซิงก์ แสดง “ปกติ / ควรตรวจสอบ / ผิดพลาด”</w:t>
-            </w:r>
-          </w:p>
-        </w:tc>
-      </w:tr>
-      <w:tr>
-        <w:tc>
-          <w:tcPr>
-            <w:tcW w:type="dxa" w:w="4762"/>
-            <w:vAlign w:val="center"/>
-            <w:tcMar>
-              <w:top w:w="100" w:type="dxa"/>
-              <w:start w:w="120" w:type="dxa"/>
-              <w:bottom w:w="100" w:type="dxa"/>
-              <w:end w:w="120" w:type="dxa"/>
-            </w:tcMar>
-            <w:shd w:fill="EDF3F8"/>
-          </w:tcPr>
-          <w:p>
-            <w:pPr>
-              <w:spacing w:after="0"/>
-              <w:jc w:val="center"/>
-            </w:pPr>
-            <w:r>
-              <w:rPr>
-                <w:rFonts w:ascii="TH Sarabun New" w:hAnsi="TH Sarabun New" w:eastAsia="TH Sarabun New"/>
-                <w:b w:val="0"/>
-                <w:color w:val="000000"/>
-                <w:sz w:val="28"/>
-              </w:rPr>
-              <w:t>•</w:t>
-            </w:r>
-          </w:p>
-        </w:tc>
-        <w:tc>
-          <w:tcPr>
-            <w:tcW w:type="dxa" w:w="4762"/>
-            <w:vAlign w:val="center"/>
-            <w:tcMar>
-              <w:top w:w="100" w:type="dxa"/>
-              <w:start w:w="120" w:type="dxa"/>
-              <w:bottom w:w="100" w:type="dxa"/>
-              <w:end w:w="120" w:type="dxa"/>
-            </w:tcMar>
-            <w:shd w:fill="EDF3F8"/>
-          </w:tcPr>
-          <w:p>
-            <w:pPr>
-              <w:spacing w:after="0"/>
-              <w:jc w:val="left"/>
-            </w:pPr>
-            <w:r>
-              <w:rPr>
-                <w:rFonts w:ascii="TH Sarabun New" w:hAnsi="TH Sarabun New" w:eastAsia="TH Sarabun New"/>
-                <w:b w:val="0"/>
-                <w:color w:val="000000"/>
-                <w:sz w:val="28"/>
-              </w:rPr>
-              <w:t>ผู้ให้บริการ AI: เพิ่ม Claude (Anthropic API) หรือ OpenAI-compatible (OpenAI, Ollama, vLLM, LM Studio, Typhoon, OpenRouter) ระบุโมเดล Base URL API key เลือก “ทดสอบ” และ “ตั้งเป็นค่าเริ่มต้น” โมเดลต้องรองรับ tool calling</w:t>
-            </w:r>
-          </w:p>
-        </w:tc>
-      </w:tr>
-    </w:tbl>
     <w:p>
       <w:pPr>
-        <w:spacing w:after="0"/>
-      </w:pPr>
+        <w:ind w:left="425" w:hanging="255"/>
+      </w:pPr>
+      <w:r>
+        <w:t>•  ตั้งค่าทั้งระบบ: ชื่อระบบ ชื่อย่อ โลโก้ ข้อความหน้าเข้าสู่ระบบ คีย์ Longdo/MapTiler URL Geocoder และค่าเริ่มต้นแผนที่</w:t>
+      </w:r>
+    </w:p>
+    <w:p>
+      <w:pPr>
+        <w:ind w:left="425" w:hanging="255"/>
+      </w:pPr>
+      <w:r>
+        <w:t>•  สถานะระบบ: ตรวจฐานข้อมูล MinIO MQTT Longdo Geocoder และงานซิงก์ แสดง “ปกติ / ควรตรวจสอบ / ผิดพลาด”</w:t>
+      </w:r>
+    </w:p>
+    <w:p>
+      <w:pPr>
+        <w:ind w:left="425" w:hanging="255"/>
+      </w:pPr>
+      <w:r>
+        <w:t>•  ผู้ให้บริการ AI: เพิ่ม Claude (Anthropic API) หรือ OpenAI-compatible (OpenAI, Ollama, vLLM, LM Studio, Typhoon, OpenRouter) ระบุโมเดล Base URL API key เลือก “ทดสอบ” และ “ตั้งเป็นค่าเริ่มต้น” โมเดลต้องรองรับ tool calling</w:t>
+      </w:r>
     </w:p>
     <w:p>
       <w:r>
@@ -9386,9 +7591,6 @@
     <w:qFormat/>
     <w:rsid w:val="00FC693F"/>
     <w:pPr>
-      <w:pBdr>
-        <w:bottom w:val="single" w:sz="8" w:space="4" w:color="4F81BD" w:themeColor="accent1"/>
-      </w:pBdr>
       <w:spacing w:after="200" w:line="252" w:lineRule="auto" w:before="0"/>
       <w:contextualSpacing/>
     </w:pPr>

</xml_diff>